<commit_message>
docs: v4.2 complète — mémoire du driver, workspace, pipelines, volumes, droits
Guide, notes de version et runbook à jour avec les points 1 à 4 ; docx régénérés.

Co-Authored-By: Claude Opus 5.5 <noreply@anthropic.com>
</commit_message>
<xml_diff>
--- a/docs/DR_Backup_Guide_Deploiement_v4.2.docx
+++ b/docs/DR_Backup_Guide_Deploiement_v4.2.docx
@@ -207,7 +207,7 @@
           </w:tcPr>
           <w:p>
             <w:r>
-              <w:t>Driver à mémoire renforcée (Standard_E8s_v3) sur le job quotidien</w:t>
+              <w:t>Correction de la saturation mémoire du driver ; driver Standard_E8s_v3</w:t>
             </w:r>
           </w:p>
         </w:tc>
@@ -218,6 +218,72 @@
           <w:p>
             <w:r>
               <w:t>§5.1</w:t>
+            </w:r>
+          </w:p>
+        </w:tc>
+      </w:tr>
+      <w:tr>
+        <w:tc>
+          <w:tcPr>
+            <w:tcW w:type="dxa" w:w="7370"/>
+          </w:tcPr>
+          <w:p>
+            <w:r>
+              <w:t>Export de tout le workspace (notebooks, fichiers), des pipelines et des permissions des jobs</w:t>
+            </w:r>
+          </w:p>
+        </w:tc>
+        <w:tc>
+          <w:tcPr>
+            <w:tcW w:type="dxa" w:w="1701"/>
+          </w:tcPr>
+          <w:p>
+            <w:r>
+              <w:t>§1.1, §9</w:t>
+            </w:r>
+          </w:p>
+        </w:tc>
+      </w:tr>
+      <w:tr>
+        <w:tc>
+          <w:tcPr>
+            <w:tcW w:type="dxa" w:w="7370"/>
+          </w:tcPr>
+          <w:p>
+            <w:r>
+              <w:t>Sauvegarde des fichiers des volumes managés, restauration à une date donnée</w:t>
+            </w:r>
+          </w:p>
+        </w:tc>
+        <w:tc>
+          <w:tcPr>
+            <w:tcW w:type="dxa" w:w="1701"/>
+          </w:tcPr>
+          <w:p>
+            <w:r>
+              <w:t>§1.1, §9</w:t>
+            </w:r>
+          </w:p>
+        </w:tc>
+      </w:tr>
+      <w:tr>
+        <w:tc>
+          <w:tcPr>
+            <w:tcW w:type="dxa" w:w="7370"/>
+          </w:tcPr>
+          <w:p>
+            <w:r>
+              <w:t>Synchronisation automatique des droits du compte de backup (job dr-backup-grants-sync)</w:t>
+            </w:r>
+          </w:p>
+        </w:tc>
+        <w:tc>
+          <w:tcPr>
+            <w:tcW w:type="dxa" w:w="1701"/>
+          </w:tcPr>
+          <w:p>
+            <w:r>
+              <w:t>§2.5</w:t>
             </w:r>
           </w:p>
         </w:tc>
@@ -437,6 +503,38 @@
           </w:tcPr>
           <w:p>
             <w:r>
+              <w:t>Fichiers des volumes managés</w:t>
+            </w:r>
+          </w:p>
+        </w:tc>
+        <w:tc>
+          <w:tcPr>
+            <w:tcW w:type="dxa" w:w="4819"/>
+          </w:tcPr>
+          <w:p>
+            <w:r>
+              <w:t>Copie incrémentale, restauration à une date donnée</w:t>
+            </w:r>
+          </w:p>
+        </w:tc>
+        <w:tc>
+          <w:tcPr>
+            <w:tcW w:type="dxa" w:w="1984"/>
+          </w:tcPr>
+          <w:p>
+            <w:r>
+              <w:t>14_volume_files</w:t>
+            </w:r>
+          </w:p>
+        </w:tc>
+      </w:tr>
+      <w:tr>
+        <w:tc>
+          <w:tcPr>
+            <w:tcW w:type="dxa" w:w="2551"/>
+          </w:tcPr>
+          <w:p>
+            <w:r>
               <w:t>Configuration du workspace</w:t>
             </w:r>
           </w:p>
@@ -447,7 +545,7 @@
           </w:tcPr>
           <w:p>
             <w:r>
-              <w:t>Définitions de jobs, notebooks sources, ACL, repos Git</w:t>
+              <w:t>Notebooks et fichiers de tout le workspace (/Repos exclu), définitions et permissions des jobs, pipelines, ACL, repos Git</w:t>
             </w:r>
           </w:p>
         </w:tc>
@@ -561,7 +659,7 @@
         <w:pStyle w:val="ListBullet"/>
       </w:pPr>
       <w:r>
-        <w:t>Le contenu (fichiers) des volumes managés : seule leur définition est sauvegardée, ils sont recréés vides. Les fichiers des volumes externes restent sur leur stockage d'origine</w:t>
+        <w:t>Les fichiers des volumes externes : ils restent sur leur stockage d'origine, dont la protection relève de sa configuration Azure</w:t>
       </w:r>
     </w:p>
     <w:p>
@@ -1326,6 +1424,11 @@
       </w:r>
     </w:p>
     <w:p>
+      <w:r>
+        <w:t>Les droits accordés sur un catalog couvrent tout son contenu, y compris les objets créés plus tard. Pour qu'un nouveau catalog ne soit pas oublié, le job dr-backup-grants-sync compare chaque jour les droits du compte de backup à ceux requis (variables backup_principal, backup_location, grants_sync_mode du bundle) : en mode report il échoue et notifie en cas d'écart, en mode apply il accorde les droits manquants. Il s'exécute avec l'identité qui déploie le bundle, qui doit être admin du metastore.</w:t>
+      </w:r>
+    </w:p>
+    <w:p>
       <w:pPr>
         <w:pStyle w:val="Heading2"/>
         <w:jc w:val="left"/>
@@ -3834,7 +3937,7 @@
     </w:p>
     <w:p>
       <w:r>
-        <w:t>Le driver est dimensionné à part : Standard_E8s_v3 (64 Go). Sa mémoire croît avec le nombre de tables traitées dans un même run, pas avec leur volume : sur un Standard_DS4_v2, elle saturait vers 4 000 tables (erreur GC overhead limit exceeded), et seule une seconde tentative aboutissait. Les workers restent en Standard_DS4_v2.</w:t>
+        <w:t>Le driver est dimensionné à part : Standard_E8s_v3 (64 Go). Sa mémoire croît avec le nombre de tables traitées dans un même run, pas avec leur volume : sur un Standard_DS4_v2, elle saturait vers 4 000 tables (erreur GC overhead limit exceeded), et seule une seconde tentative aboutissait. La cause (un état Delta mis en cache par table, jamais libéré) est corrigée dans le notebook de copie ; le driver E8s_v3 reste une marge de sécurité. Les workers restent en Standard_DS4_v2.</w:t>
       </w:r>
     </w:p>
     <w:p>
@@ -5979,7 +6082,7 @@
           </w:tcPr>
           <w:p>
             <w:r>
-              <w:t>Notebooks sources, ACL, repos Git</w:t>
+              <w:t>Notebooks, fichiers et dashboards, ACL, repos Git</w:t>
             </w:r>
           </w:p>
         </w:tc>
@@ -6053,7 +6156,7 @@
           </w:tcPr>
           <w:p>
             <w:r>
-              <w:t>Orchestration de 07, 08, 09, 11 et 12</w:t>
+              <w:t>Orchestration de 07, 08, 09, 11, 12, 13 et 15</w:t>
             </w:r>
           </w:p>
         </w:tc>
@@ -6118,6 +6221,70 @@
           <w:p>
             <w:r>
               <w:t>Tous, ou filtrés par catalog</w:t>
+            </w:r>
+          </w:p>
+        </w:tc>
+      </w:tr>
+      <w:tr>
+        <w:tc>
+          <w:tcPr>
+            <w:tcW w:type="dxa" w:w="2551"/>
+          </w:tcPr>
+          <w:p>
+            <w:r>
+              <w:t>13_restore_pipelines</w:t>
+            </w:r>
+          </w:p>
+        </w:tc>
+        <w:tc>
+          <w:tcPr>
+            <w:tcW w:type="dxa" w:w="2835"/>
+          </w:tcPr>
+          <w:p>
+            <w:r>
+              <w:t>Pipelines (définition, permissions)</w:t>
+            </w:r>
+          </w:p>
+        </w:tc>
+        <w:tc>
+          <w:tcPr>
+            <w:tcW w:type="dxa" w:w="3685"/>
+          </w:tcPr>
+          <w:p>
+            <w:r>
+              <w:t>Tous, ou filtrés par nom ; après les notebooks</w:t>
+            </w:r>
+          </w:p>
+        </w:tc>
+      </w:tr>
+      <w:tr>
+        <w:tc>
+          <w:tcPr>
+            <w:tcW w:type="dxa" w:w="2551"/>
+          </w:tcPr>
+          <w:p>
+            <w:r>
+              <w:t>15_restore_volume_files</w:t>
+            </w:r>
+          </w:p>
+        </w:tc>
+        <w:tc>
+          <w:tcPr>
+            <w:tcW w:type="dxa" w:w="2835"/>
+          </w:tcPr>
+          <w:p>
+            <w:r>
+              <w:t>Fichiers des volumes managés</w:t>
+            </w:r>
+          </w:p>
+        </w:tc>
+        <w:tc>
+          <w:tcPr>
+            <w:tcW w:type="dxa" w:w="3685"/>
+          </w:tcPr>
+          <w:p>
+            <w:r>
+              <w:t>Un volume ou tous, à une date donnée ; après 12</w:t>
             </w:r>
           </w:p>
         </w:tc>

</xml_diff>

<commit_message>
docs: lib/ trouvé automatiquement, variable lib_path supprimée (guide + notes v4.2)
Co-Authored-By: Claude Opus 5.5 <noreply@anthropic.com>
</commit_message>
<xml_diff>
--- a/docs/DR_Backup_Guide_Deploiement_v4.2.docx
+++ b/docs/DR_Backup_Guide_Deploiement_v4.2.docx
@@ -51,7 +51,7 @@
           <w:color w:val="808080"/>
           <w:sz w:val="22"/>
         </w:rPr>
-        <w:t>KeyIT — 02/10/2026</w:t>
+        <w:t>KeyIT — 07/10/2026</w:t>
       </w:r>
     </w:p>
     <w:p/>
@@ -328,6 +328,28 @@
           <w:p>
             <w:r>
               <w:t>—</w:t>
+            </w:r>
+          </w:p>
+        </w:tc>
+      </w:tr>
+      <w:tr>
+        <w:tc>
+          <w:tcPr>
+            <w:tcW w:type="dxa" w:w="7370"/>
+          </w:tcPr>
+          <w:p>
+            <w:r>
+              <w:t>Dossier lib/ trouvé automatiquement : la variable lib_path disparaît</w:t>
+            </w:r>
+          </w:p>
+        </w:tc>
+        <w:tc>
+          <w:tcPr>
+            <w:tcW w:type="dxa" w:w="1701"/>
+          </w:tcPr>
+          <w:p>
+            <w:r>
+              <w:t>§4.1, §4.2</w:t>
             </w:r>
           </w:p>
         </w:tc>
@@ -2701,7 +2723,7 @@
           <w:color w:val="C00000"/>
           <w:sz w:val="20"/>
         </w:rPr>
-        <w:t>Attention : le dossier lib/ est indispensable : les notebooks 01, 03, 04 et 12 en dépendent. Une extraction partielle de l'archive provoque un échec de l'étape de rapport, et le backup des volumes et fonctions est sauté (avertissement dans la sortie de 01_uc_metadata).</w:t>
+        <w:t>Attention : le dossier lib/ est indispensable : la plupart des notebooks en dépendent (seuls 07_restore et 11_restore_grants sont autonomes). Le bundle le déploie à côté des notebooks et les jobs le trouvent automatiquement : aucun chemin à renseigner. Une extraction partielle de l'archive provoque un échec de l'étape de rapport, et le backup des volumes et fonctions est sauté (avertissement dans la sortie de 01_uc_metadata).</w:t>
       </w:r>
     </w:p>
     <w:p>
@@ -2718,7 +2740,7 @@
     </w:p>
     <w:p>
       <w:r>
-        <w:t>Quatre valeurs sont à adapter à l'environnement cible. Tout le reste peut rester en configuration par défaut.</w:t>
+        <w:t>Trois valeurs sont à adapter à l'environnement cible. Tout le reste peut rester en configuration par défaut.</w:t>
       </w:r>
     </w:p>
     <w:tbl>
@@ -2782,28 +2804,6 @@
           <w:p>
             <w:r>
               <w:t>abfss://&lt;container&gt;@&lt;compte&gt;.dfs.core.windows.net/backup</w:t>
-            </w:r>
-          </w:p>
-        </w:tc>
-      </w:tr>
-      <w:tr>
-        <w:tc>
-          <w:tcPr>
-            <w:tcW w:type="dxa" w:w="2835"/>
-          </w:tcPr>
-          <w:p>
-            <w:r>
-              <w:t>lib_path</w:t>
-            </w:r>
-          </w:p>
-        </w:tc>
-        <w:tc>
-          <w:tcPr>
-            <w:tcW w:type="dxa" w:w="6236"/>
-          </w:tcPr>
-          <w:p>
-            <w:r>
-              <w:t>Chemin workspace du dossier lib/ après déploiement</w:t>
             </w:r>
           </w:p>
         </w:tc>

</xml_diff>

<commit_message>
docs: v4.2 — correctifs du test aller-retour et de l'analyse du run client
Notes de version §2.8 à §2.16 (jobs sans tâches, workspace incomplet, permissions non
restaurées, vues et catalogues, tables non sauvegardées, table recréée, column mapping,
tables périmées, filtres de l'orchestrateur), constats et vérifications après mise à jour ;
guide (nouveautés, §9 filtres et date de référence, A.6) ; runbook (widgets).

Co-Authored-By: Claude Opus 5.5 <noreply@anthropic.com>
</commit_message>
<xml_diff>
--- a/docs/DR_Backup_Guide_Deploiement_v4.2.docx
+++ b/docs/DR_Backup_Guide_Deploiement_v4.2.docx
@@ -350,6 +350,72 @@
           <w:p>
             <w:r>
               <w:t>§4.1, §4.2</w:t>
+            </w:r>
+          </w:p>
+        </w:tc>
+      </w:tr>
+      <w:tr>
+        <w:tc>
+          <w:tcPr>
+            <w:tcW w:type="dxa" w:w="7370"/>
+          </w:tcPr>
+          <w:p>
+            <w:r>
+              <w:t>Jobs sauvegardés avec leurs tâches ; export du workspace sans perte (réessais)</w:t>
+            </w:r>
+          </w:p>
+        </w:tc>
+        <w:tc>
+          <w:tcPr>
+            <w:tcW w:type="dxa" w:w="1701"/>
+          </w:tcPr>
+          <w:p>
+            <w:r>
+              <w:t>—</w:t>
+            </w:r>
+          </w:p>
+        </w:tc>
+      </w:tr>
+      <w:tr>
+        <w:tc>
+          <w:tcPr>
+            <w:tcW w:type="dxa" w:w="7370"/>
+          </w:tcPr>
+          <w:p>
+            <w:r>
+              <w:t>Rapport : tables sauvegardées, non clonables et en erreur, avec leur liste</w:t>
+            </w:r>
+          </w:p>
+        </w:tc>
+        <w:tc>
+          <w:tcPr>
+            <w:tcW w:type="dxa" w:w="1701"/>
+          </w:tcPr>
+          <w:p>
+            <w:r>
+              <w:t>A.6</w:t>
+            </w:r>
+          </w:p>
+        </w:tc>
+      </w:tr>
+      <w:tr>
+        <w:tc>
+          <w:tcPr>
+            <w:tcW w:type="dxa" w:w="7370"/>
+          </w:tcPr>
+          <w:p>
+            <w:r>
+              <w:t>Restauration limitée aux tables du backup de référence ; filtres de l'orchestrateur</w:t>
+            </w:r>
+          </w:p>
+        </w:tc>
+        <w:tc>
+          <w:tcPr>
+            <w:tcW w:type="dxa" w:w="1701"/>
+          </w:tcPr>
+          <w:p>
+            <w:r>
+              <w:t>§9</w:t>
             </w:r>
           </w:p>
         </w:tc>
@@ -6305,6 +6371,16 @@
       </w:r>
     </w:p>
     <w:p>
+      <w:r>
+        <w:t>Paramètres de périmètre de 10_restore_orchestrator : catalog_filter (permissions, volumes et fonctions), job_filter (nom de job), notebook_filter (chemin dans le workspace, pour les notebooks et leurs permissions), pipeline_filter (nom de pipeline) et volume_filter (catalogue.schéma.volume, jokers acceptés). Laissés vides, ils couvrent tout le backup : pour une restauration partielle, toujours les renseigner.</w:t>
+      </w:r>
+    </w:p>
+    <w:p>
+      <w:r>
+        <w:t>07_restore ne restaure que les tables sauvegardées avec succès à la date de référence : le dernier backup, ou le dernier au plus tard à la date du point de restauration. Les tables présentes dans le stockage mais absentes de ce backup sont listées comme périmées ; include_stale = true les restaure quand même, dans l'état de leur dernier backup réussi.</w:t>
+      </w:r>
+    </w:p>
+    <w:p>
       <w:pPr>
         <w:pStyle w:val="Heading2"/>
         <w:jc w:val="left"/>
@@ -7358,12 +7434,12 @@
         <w:rPr>
           <w:color w:val="1F497D"/>
         </w:rPr>
-        <w:t>A.6 Une table est absente du backup sans message d'erreur</w:t>
+        <w:t>A.6 Une table est absente du backup</w:t>
       </w:r>
     </w:p>
     <w:p>
       <w:r>
-        <w:t>Comportement attendu dans les cas suivants :</w:t>
+        <w:t>Le rapport du jour liste les tables non sauvegardées et leur cause (section « Tables non sauvegardées »). Comportement attendu dans les cas suivants :</w:t>
       </w:r>
     </w:p>
     <w:p>
@@ -7380,6 +7456,14 @@
       </w:pPr>
       <w:r>
         <w:t>Table dans un format autre que Delta</w:t>
+      </w:r>
+    </w:p>
+    <w:p>
+      <w:pPr>
+        <w:pStyle w:val="ListBullet"/>
+      </w:pPr>
+      <w:r>
+        <w:t>Table protégée par un filtre de lignes ou un masque de colonnes : non clonable, listée comme non clonable dans le rapport</w:t>
       </w:r>
     </w:p>
     <w:p>

</xml_diff>

<commit_message>
fix: metric views absentes du backup
Sur le runtime des jobs, SHOW CREATE TABLE refuse les metric views
(UNSUPPORTED_SHOW_CREATE_TABLE.ON_METRIC_VIEW, constaté chez le client) : leur définition
n'était pas exportée. Elle est reconstruite depuis le YAML de DESCRIBE TABLE EXTENDED … AS
JSON (CREATE VIEW … WITH METRICS, commentaire compris). Vérifié sur KeyIT dev (DBR 17.3) :
recréée depuis 03_tables.sql, même type et mêmes résultats.

Notes de version §2.17, guide (prérequis USE CATALOG sur system) régénérés.

Co-Authored-By: Claude Opus 5.5 <noreply@anthropic.com>
</commit_message>
<xml_diff>
--- a/docs/DR_Backup_Guide_Deploiement_v4.2.docx
+++ b/docs/DR_Backup_Guide_Deploiement_v4.2.docx
@@ -51,7 +51,7 @@
           <w:color w:val="808080"/>
           <w:sz w:val="22"/>
         </w:rPr>
-        <w:t>KeyIT — 07/10/2026</w:t>
+        <w:t>KeyIT — 08/10/2026</w:t>
       </w:r>
     </w:p>
     <w:p/>
@@ -1449,7 +1449,7 @@
           </w:tcPr>
           <w:p>
             <w:r>
-              <w:t>Metastore</w:t>
+              <w:t>Catalog system</w:t>
             </w:r>
           </w:p>
         </w:tc>
@@ -1459,7 +1459,7 @@
           </w:tcPr>
           <w:p>
             <w:r>
-              <w:t>Aucun droit particulier</w:t>
+              <w:t>USE CATALOG</w:t>
             </w:r>
           </w:p>
         </w:tc>
@@ -1469,7 +1469,7 @@
           </w:tcPr>
           <w:p>
             <w:r>
-              <w:t>La lecture d'information_schema suffit</w:t>
+              <w:t>Lire information_schema, sur lequel s'appuie le tri tables / vues</w:t>
             </w:r>
           </w:p>
         </w:tc>
@@ -1496,6 +1496,22 @@
         <w:t>GRANT USE CATALOG, USE SCHEMA, SELECT</w:t>
         <w:br/>
         <w:t xml:space="preserve">  ON CATALOG `&lt;catalog-a-sauvegarder&gt;` TO `&lt;application-id-du-sp&gt;`;</w:t>
+        <w:br/>
+        <w:br/>
+        <w:t>GRANT USE CATALOG ON CATALOG `system` TO `&lt;application-id-du-sp&gt;`;</w:t>
+      </w:r>
+    </w:p>
+    <w:p>
+      <w:pPr>
+        <w:ind w:left="283"/>
+      </w:pPr>
+      <w:r>
+        <w:rPr>
+          <w:i/>
+          <w:color w:val="707070"/>
+          <w:sz w:val="20"/>
+        </w:rPr>
+        <w:t>Note : sans USE CATALOG sur system, chaque lecture d'information_schema échoue (INSUFFICIENT_PERMISSIONS). Le backup lit alors le type des tables via l'API Unity Catalog, plus lentement : un appel par schéma. Le job dr-backup-grants-sync vérifie ce droit.</w:t>
       </w:r>
     </w:p>
     <w:p>

</xml_diff>

<commit_message>
docs: comportement de la restauration quand l'objet existe déjà
Tableau objet par objet (écrasé / inchangé / ajouté / remplacé) dans le guide §9 et le
runbook ; notes de version §2.18 (replace au lieu de recreate) et §2.19 (objets différents
du backup signalés) ; synthèse des corrections.

Co-Authored-By: Claude Opus 5.5 <noreply@anthropic.com>
</commit_message>
<xml_diff>
--- a/docs/DR_Backup_Guide_Deploiement_v4.2.docx
+++ b/docs/DR_Backup_Guide_Deploiement_v4.2.docx
@@ -6394,6 +6394,373 @@
     <w:p>
       <w:r>
         <w:t>07_restore ne restaure que les tables sauvegardées avec succès à la date de référence : le dernier backup, ou le dernier au plus tard à la date du point de restauration. Les tables présentes dans le stockage mais absentes de ce backup sont listées comme périmées ; include_stale = true les restaure quand même, dans l'état de leur dernier backup réussi.</w:t>
+      </w:r>
+    </w:p>
+    <w:p>
+      <w:r>
+        <w:t>Comportement quand l'objet existe déjà dans l'environnement cible :</w:t>
+      </w:r>
+    </w:p>
+    <w:tbl>
+      <w:tblPr>
+        <w:tblStyle w:val="TableGrid"/>
+        <w:tblW w:type="auto" w:w="0"/>
+        <w:jc w:val="left"/>
+        <w:tblLook w:firstColumn="1" w:firstRow="1" w:lastColumn="0" w:lastRow="0" w:noHBand="0" w:noVBand="1" w:val="04A0"/>
+      </w:tblPr>
+      <w:tblGrid>
+        <w:gridCol w:w="2880"/>
+        <w:gridCol w:w="2880"/>
+        <w:gridCol w:w="2880"/>
+      </w:tblGrid>
+      <w:tr>
+        <w:tc>
+          <w:tcPr>
+            <w:tcW w:type="dxa" w:w="2268"/>
+            <w:shd w:val="clear" w:color="auto" w:fill="1F497D"/>
+          </w:tcPr>
+          <w:p>
+            <w:r>
+              <w:rPr>
+                <w:b/>
+                <w:color w:val="FFFFFF"/>
+              </w:rPr>
+              <w:t>Objet</w:t>
+            </w:r>
+          </w:p>
+        </w:tc>
+        <w:tc>
+          <w:tcPr>
+            <w:tcW w:type="dxa" w:w="2268"/>
+            <w:shd w:val="clear" w:color="auto" w:fill="1F497D"/>
+          </w:tcPr>
+          <w:p>
+            <w:r>
+              <w:rPr>
+                <w:b/>
+                <w:color w:val="FFFFFF"/>
+              </w:rPr>
+              <w:t>Notebook</w:t>
+            </w:r>
+          </w:p>
+        </w:tc>
+        <w:tc>
+          <w:tcPr>
+            <w:tcW w:type="dxa" w:w="4535"/>
+            <w:shd w:val="clear" w:color="auto" w:fill="1F497D"/>
+          </w:tcPr>
+          <w:p>
+            <w:r>
+              <w:rPr>
+                <w:b/>
+                <w:color w:val="FFFFFF"/>
+              </w:rPr>
+              <w:t>Si l'objet existe déjà</w:t>
+            </w:r>
+          </w:p>
+        </w:tc>
+      </w:tr>
+      <w:tr>
+        <w:tc>
+          <w:tcPr>
+            <w:tcW w:type="dxa" w:w="2268"/>
+          </w:tcPr>
+          <w:p>
+            <w:r>
+              <w:t>Tables Delta</w:t>
+            </w:r>
+          </w:p>
+        </w:tc>
+        <w:tc>
+          <w:tcPr>
+            <w:tcW w:type="dxa" w:w="2268"/>
+          </w:tcPr>
+          <w:p>
+            <w:r>
+              <w:t>07_restore</w:t>
+            </w:r>
+          </w:p>
+        </w:tc>
+        <w:tc>
+          <w:tcPr>
+            <w:tcW w:type="dxa" w:w="4535"/>
+          </w:tcPr>
+          <w:p>
+            <w:r>
+              <w:t>Écrasée (CREATE OR REPLACE … DEEP CLONE). L'historique Delta est conservé : RESTORE TABLE … VERSION AS OF revient à l'état d'avant la restauration.</w:t>
+            </w:r>
+          </w:p>
+        </w:tc>
+      </w:tr>
+      <w:tr>
+        <w:tc>
+          <w:tcPr>
+            <w:tcW w:type="dxa" w:w="2268"/>
+          </w:tcPr>
+          <w:p>
+            <w:r>
+              <w:t>Catalogues, schémas, tables, vues (DDL)</w:t>
+            </w:r>
+          </w:p>
+        </w:tc>
+        <w:tc>
+          <w:tcPr>
+            <w:tcW w:type="dxa" w:w="2268"/>
+          </w:tcPr>
+          <w:p>
+            <w:r>
+              <w:t>restore_uc.py</w:t>
+            </w:r>
+          </w:p>
+        </w:tc>
+        <w:tc>
+          <w:tcPr>
+            <w:tcW w:type="dxa" w:w="4535"/>
+          </w:tcPr>
+          <w:p>
+            <w:r>
+              <w:t>Inchangés (IF NOT EXISTS ou « already exists » ignoré).</w:t>
+            </w:r>
+          </w:p>
+        </w:tc>
+      </w:tr>
+      <w:tr>
+        <w:tc>
+          <w:tcPr>
+            <w:tcW w:type="dxa" w:w="2268"/>
+          </w:tcPr>
+          <w:p>
+            <w:r>
+              <w:t>Volumes, fonctions</w:t>
+            </w:r>
+          </w:p>
+        </w:tc>
+        <w:tc>
+          <w:tcPr>
+            <w:tcW w:type="dxa" w:w="2268"/>
+          </w:tcPr>
+          <w:p>
+            <w:r>
+              <w:t>12_restore_uc_objects</w:t>
+            </w:r>
+          </w:p>
+        </w:tc>
+        <w:tc>
+          <w:tcPr>
+            <w:tcW w:type="dxa" w:w="4535"/>
+          </w:tcPr>
+          <w:p>
+            <w:r>
+              <w:t>Inchangés ; signalés « DIFFÉRENT » si leur définition diffère du backup.</w:t>
+            </w:r>
+          </w:p>
+        </w:tc>
+      </w:tr>
+      <w:tr>
+        <w:tc>
+          <w:tcPr>
+            <w:tcW w:type="dxa" w:w="2268"/>
+          </w:tcPr>
+          <w:p>
+            <w:r>
+              <w:t>Fichiers des volumes</w:t>
+            </w:r>
+          </w:p>
+        </w:tc>
+        <w:tc>
+          <w:tcPr>
+            <w:tcW w:type="dxa" w:w="2268"/>
+          </w:tcPr>
+          <w:p>
+            <w:r>
+              <w:t>15_restore_volume_files</w:t>
+            </w:r>
+          </w:p>
+        </w:tc>
+        <w:tc>
+          <w:tcPr>
+            <w:tcW w:type="dxa" w:w="4535"/>
+          </w:tcPr>
+          <w:p>
+            <w:r>
+              <w:t>Écrasés ; les fichiers absents du backup sont conservés et listés.</w:t>
+            </w:r>
+          </w:p>
+        </w:tc>
+      </w:tr>
+      <w:tr>
+        <w:tc>
+          <w:tcPr>
+            <w:tcW w:type="dxa" w:w="2268"/>
+          </w:tcPr>
+          <w:p>
+            <w:r>
+              <w:t>Permissions Unity Catalog</w:t>
+            </w:r>
+          </w:p>
+        </w:tc>
+        <w:tc>
+          <w:tcPr>
+            <w:tcW w:type="dxa" w:w="2268"/>
+          </w:tcPr>
+          <w:p>
+            <w:r>
+              <w:t>11_restore_grants</w:t>
+            </w:r>
+          </w:p>
+        </w:tc>
+        <w:tc>
+          <w:tcPr>
+            <w:tcW w:type="dxa" w:w="4535"/>
+          </w:tcPr>
+          <w:p>
+            <w:r>
+              <w:t>Ajoutées ; les permissions accordées depuis le backup ne sont pas retirées.</w:t>
+            </w:r>
+          </w:p>
+        </w:tc>
+      </w:tr>
+      <w:tr>
+        <w:tc>
+          <w:tcPr>
+            <w:tcW w:type="dxa" w:w="2268"/>
+          </w:tcPr>
+          <w:p>
+            <w:r>
+              <w:t>Notebooks, fichiers, tableaux de bord</w:t>
+            </w:r>
+          </w:p>
+        </w:tc>
+        <w:tc>
+          <w:tcPr>
+            <w:tcW w:type="dxa" w:w="2268"/>
+          </w:tcPr>
+          <w:p>
+            <w:r>
+              <w:t>08_restore_workspace</w:t>
+            </w:r>
+          </w:p>
+        </w:tc>
+        <w:tc>
+          <w:tcPr>
+            <w:tcW w:type="dxa" w:w="4535"/>
+          </w:tcPr>
+          <w:p>
+            <w:r>
+              <w:t>Écrasés.</w:t>
+            </w:r>
+          </w:p>
+        </w:tc>
+      </w:tr>
+      <w:tr>
+        <w:tc>
+          <w:tcPr>
+            <w:tcW w:type="dxa" w:w="2268"/>
+          </w:tcPr>
+          <w:p>
+            <w:r>
+              <w:t>Permissions du workspace</w:t>
+            </w:r>
+          </w:p>
+        </w:tc>
+        <w:tc>
+          <w:tcPr>
+            <w:tcW w:type="dxa" w:w="2268"/>
+          </w:tcPr>
+          <w:p>
+            <w:r>
+              <w:t>08_restore_workspace</w:t>
+            </w:r>
+          </w:p>
+        </w:tc>
+        <w:tc>
+          <w:tcPr>
+            <w:tcW w:type="dxa" w:w="4535"/>
+          </w:tcPr>
+          <w:p>
+            <w:r>
+              <w:t>Remplacées : les permissions directes accordées depuis le backup sont retirées.</w:t>
+            </w:r>
+          </w:p>
+        </w:tc>
+      </w:tr>
+      <w:tr>
+        <w:tc>
+          <w:tcPr>
+            <w:tcW w:type="dxa" w:w="2268"/>
+          </w:tcPr>
+          <w:p>
+            <w:r>
+              <w:t>Jobs</w:t>
+            </w:r>
+          </w:p>
+        </w:tc>
+        <w:tc>
+          <w:tcPr>
+            <w:tcW w:type="dxa" w:w="2268"/>
+          </w:tcPr>
+          <w:p>
+            <w:r>
+              <w:t>09_restore_jobs</w:t>
+            </w:r>
+          </w:p>
+        </w:tc>
+        <w:tc>
+          <w:tcPr>
+            <w:tcW w:type="dxa" w:w="4535"/>
+          </w:tcPr>
+          <w:p>
+            <w:r>
+              <w:t>skip (défaut) : inchangé. replace : définition remplacée en place, même job et même historique ; permissions du backup ajoutées.</w:t>
+            </w:r>
+          </w:p>
+        </w:tc>
+      </w:tr>
+      <w:tr>
+        <w:tc>
+          <w:tcPr>
+            <w:tcW w:type="dxa" w:w="2268"/>
+          </w:tcPr>
+          <w:p>
+            <w:r>
+              <w:t>Pipelines</w:t>
+            </w:r>
+          </w:p>
+        </w:tc>
+        <w:tc>
+          <w:tcPr>
+            <w:tcW w:type="dxa" w:w="2268"/>
+          </w:tcPr>
+          <w:p>
+            <w:r>
+              <w:t>13_restore_pipelines</w:t>
+            </w:r>
+          </w:p>
+        </w:tc>
+        <w:tc>
+          <w:tcPr>
+            <w:tcW w:type="dxa" w:w="4535"/>
+          </w:tcPr>
+          <w:p>
+            <w:r>
+              <w:t>skip (défaut) : inchangé. replace : définition mise à jour en place, même pipeline et mêmes tables ; permissions du backup ajoutées.</w:t>
+            </w:r>
+          </w:p>
+        </w:tc>
+      </w:tr>
+    </w:tbl>
+    <w:p/>
+    <w:p>
+      <w:pPr>
+        <w:ind w:left="283"/>
+      </w:pPr>
+      <w:r>
+        <w:rPr>
+          <w:b/>
+          <w:color w:val="C00000"/>
+          <w:sz w:val="20"/>
+        </w:rPr>
+        <w:t>Attention : une restauration des tables écrase les données actuelles par celles du backup. Sur un environnement encore en service, restaurer d'abord vers un catalogue de contrôle (target_catalog) pour comparer, puis à l'emplacement d'origine.</w:t>
       </w:r>
     </w:p>
     <w:p>

</xml_diff>

<commit_message>
docs: utilisation et lecture des contrôles, plan de reconstruction des tables non sauvegardées
Guide de déploiement :
- §1.2 : données des tables à filtre de lignes / masque de colonnes non sauvegardées
- §3.4 : tous les paramètres de diag_03, lecture du rapport (colonnes, verdicts, actions)
- §3.5 (nouveau) : diag_04, exécution sous l'identité du backup (Run as), verdicts, piège
  is_account_group_member, vérification manuelle
- §8 : dr-backup-grants-sync (planification, modes report / apply, identité d'exécution)
- §9.3 (nouveau) : plan de reconstruction (responsabilité, lignage, rechargement complet,
  fiche du plan de reprise)
- §10 : checklist complétée
Notes de version §4 : job grants-sync et ses variables, USE CATALOG sur system, contrôles
après mise à jour. Runbook : verdicts, diag_04, tables non sauvegardées.

Co-Authored-By: Claude Opus 5.5 <noreply@anthropic.com>
</commit_message>
<xml_diff>
--- a/docs/DR_Backup_Guide_Deploiement_v4.2.docx
+++ b/docs/DR_Backup_Guide_Deploiement_v4.2.docx
@@ -708,6 +708,14 @@
       </w:pPr>
       <w:r>
         <w:t>Les vues matérialisées et les Streaming Tables (non clonables)</w:t>
+      </w:r>
+    </w:p>
+    <w:p>
+      <w:pPr>
+        <w:pStyle w:val="ListBullet"/>
+      </w:pPr>
+      <w:r>
+        <w:t>Les données des tables protégées par un filtre de lignes ou un masque de colonnes : DEEP CLONE les refuse quel que soit le compte. Leur définition est sauvegardée, leurs données sont à reconstruire (§3.5, §9.3)</w:t>
       </w:r>
     </w:p>
     <w:p>
@@ -2630,7 +2638,7 @@
           </w:tcPr>
           <w:p>
             <w:r>
-              <w:t>Groupe ou service principal du backup : vérifie qu'il a les droits sur chaque objet</w:t>
+              <w:t>Groupe ou service principal du backup : vérifie qu'il a les droits sur chaque objet (vide = non vérifié)</w:t>
             </w:r>
           </w:p>
         </w:tc>
@@ -2642,7 +2650,7 @@
           </w:tcPr>
           <w:p>
             <w:r>
-              <w:t>iac_identities</w:t>
+              <w:t>backup_root</w:t>
             </w:r>
           </w:p>
         </w:tc>
@@ -2652,7 +2660,7 @@
           </w:tcPr>
           <w:p>
             <w:r>
-              <w:t>Identités qui déploient l'IaC : les objets qu'elles ont créés sont classés « as code »</w:t>
+              <w:t>Racine du backup : contrôle le résultat du dernier backup réel et détecte la version déployée</w:t>
             </w:r>
           </w:p>
         </w:tc>
@@ -2664,7 +2672,7 @@
           </w:tcPr>
           <w:p>
             <w:r>
-              <w:t>iac_file</w:t>
+              <w:t>backup_version</w:t>
             </w:r>
           </w:p>
         </w:tc>
@@ -2674,7 +2682,7 @@
           </w:tcPr>
           <w:p>
             <w:r>
-              <w:t>Liste optionnelle d'objets gérés en code, un nom complet par ligne</w:t>
+              <w:t>auto (détectée depuis backup_root), v4.1 ou v4.2 : règles de couverture appliquées</w:t>
             </w:r>
           </w:p>
         </w:tc>
@@ -2686,7 +2694,7 @@
           </w:tcPr>
           <w:p>
             <w:r>
-              <w:t>excluded_catalogs</w:t>
+              <w:t>iac_identities</w:t>
             </w:r>
           </w:p>
         </w:tc>
@@ -2696,7 +2704,7 @@
           </w:tcPr>
           <w:p>
             <w:r>
-              <w:t>Catalogs exclus volontairement (tests, bacs à sable)</w:t>
+              <w:t>Identités qui déploient l'IaC : les objets qu'elles ont créés sont classés « as code »</w:t>
             </w:r>
           </w:p>
         </w:tc>
@@ -2708,7 +2716,7 @@
           </w:tcPr>
           <w:p>
             <w:r>
-              <w:t>backup_root</w:t>
+              <w:t>iac_file</w:t>
             </w:r>
           </w:p>
         </w:tc>
@@ -2718,7 +2726,73 @@
           </w:tcPr>
           <w:p>
             <w:r>
-              <w:t>Racine du backup : contrôle le résultat du dernier backup réel</w:t>
+              <w:t>Liste optionnelle d'objets gérés en code, un nom complet par ligne</w:t>
+            </w:r>
+          </w:p>
+        </w:tc>
+      </w:tr>
+      <w:tr>
+        <w:tc>
+          <w:tcPr>
+            <w:tcW w:type="dxa" w:w="2268"/>
+          </w:tcPr>
+          <w:p>
+            <w:r>
+              <w:t>excluded_catalogs</w:t>
+            </w:r>
+          </w:p>
+        </w:tc>
+        <w:tc>
+          <w:tcPr>
+            <w:tcW w:type="dxa" w:w="6803"/>
+          </w:tcPr>
+          <w:p>
+            <w:r>
+              <w:t>Catalogs exclus volontairement (tests, bacs à sable)</w:t>
+            </w:r>
+          </w:p>
+        </w:tc>
+      </w:tr>
+      <w:tr>
+        <w:tc>
+          <w:tcPr>
+            <w:tcW w:type="dxa" w:w="2268"/>
+          </w:tcPr>
+          <w:p>
+            <w:r>
+              <w:t>count_workspace_objects</w:t>
+            </w:r>
+          </w:p>
+        </w:tc>
+        <w:tc>
+          <w:tcPr>
+            <w:tcW w:type="dxa" w:w="6803"/>
+          </w:tcPr>
+          <w:p>
+            <w:r>
+              <w:t>Compter les notebooks et fichiers par dossier du workspace (plus long)</w:t>
+            </w:r>
+          </w:p>
+        </w:tc>
+      </w:tr>
+      <w:tr>
+        <w:tc>
+          <w:tcPr>
+            <w:tcW w:type="dxa" w:w="2268"/>
+          </w:tcPr>
+          <w:p>
+            <w:r>
+              <w:t>output_dir</w:t>
+            </w:r>
+          </w:p>
+        </w:tc>
+        <w:tc>
+          <w:tcPr>
+            <w:tcW w:type="dxa" w:w="6803"/>
+          </w:tcPr>
+          <w:p>
+            <w:r>
+              <w:t>Dossier du workspace où écrire le HTML et l'Excel (vide = dossier personnel)</w:t>
             </w:r>
           </w:p>
         </w:tc>
@@ -2735,7 +2809,834 @@
           <w:color w:val="707070"/>
           <w:sz w:val="20"/>
         </w:rPr>
-        <w:t>Note : à exécuter avec un compte admin du metastore, qui voit tous les objets. Le rapport est conçu pour être présenté tel quel : synthèse par type et par catalog, objets à traiter, légende des moyens de restauration.</w:t>
+        <w:t>Note : à exécuter avec un compte admin du metastore, qui voit tous les objets. Toujours renseigner backup_root : sans lui, le rapport ne peut pas déterminer la version déployée et applique par prudence les règles de la v4.1, qui classent à tort volumes, fonctions et pipelines en « non couvert ».</w:t>
+      </w:r>
+    </w:p>
+    <w:p>
+      <w:pPr>
+        <w:pStyle w:val="Heading3"/>
+        <w:jc w:val="left"/>
+      </w:pPr>
+      <w:r>
+        <w:rPr>
+          <w:color w:val="1F497D"/>
+        </w:rPr>
+        <w:t>Lire le rapport</w:t>
+      </w:r>
+    </w:p>
+    <w:p>
+      <w:r>
+        <w:t>L'en-tête indique les règles appliquées (« règles du backup v4.2 · dernier backup … ») puis les points d'attention : version, objets inaccessibles au compte de backup, tables protégées, droit manquant sur le catalog system. Viennent ensuite une synthèse par type et par catalog, puis le détail objet par objet (onglet de détail de l'Excel), dont voici les colonnes :</w:t>
+      </w:r>
+    </w:p>
+    <w:tbl>
+      <w:tblPr>
+        <w:tblStyle w:val="TableGrid"/>
+        <w:tblW w:type="auto" w:w="0"/>
+        <w:jc w:val="left"/>
+        <w:tblLook w:firstColumn="1" w:firstRow="1" w:lastColumn="0" w:lastRow="0" w:noHBand="0" w:noVBand="1" w:val="04A0"/>
+      </w:tblPr>
+      <w:tblGrid>
+        <w:gridCol w:w="4320"/>
+        <w:gridCol w:w="4320"/>
+      </w:tblGrid>
+      <w:tr>
+        <w:tc>
+          <w:tcPr>
+            <w:tcW w:type="dxa" w:w="1984"/>
+            <w:shd w:val="clear" w:color="auto" w:fill="1F497D"/>
+          </w:tcPr>
+          <w:p>
+            <w:r>
+              <w:rPr>
+                <w:b/>
+                <w:color w:val="FFFFFF"/>
+              </w:rPr>
+              <w:t>Colonne</w:t>
+            </w:r>
+          </w:p>
+        </w:tc>
+        <w:tc>
+          <w:tcPr>
+            <w:tcW w:type="dxa" w:w="7087"/>
+            <w:shd w:val="clear" w:color="auto" w:fill="1F497D"/>
+          </w:tcPr>
+          <w:p>
+            <w:r>
+              <w:rPr>
+                <w:b/>
+                <w:color w:val="FFFFFF"/>
+              </w:rPr>
+              <w:t>Signification</w:t>
+            </w:r>
+          </w:p>
+        </w:tc>
+      </w:tr>
+      <w:tr>
+        <w:tc>
+          <w:tcPr>
+            <w:tcW w:type="dxa" w:w="1984"/>
+          </w:tcPr>
+          <w:p>
+            <w:r>
+              <w:t>Définition</w:t>
+            </w:r>
+          </w:p>
+        </w:tc>
+        <w:tc>
+          <w:tcPr>
+            <w:tcW w:type="dxa" w:w="7087"/>
+          </w:tcPr>
+          <w:p>
+            <w:r>
+              <w:t>Comment la définition est restaurée : Script backup, As code, Autre moyen, Non couvert</w:t>
+            </w:r>
+          </w:p>
+        </w:tc>
+      </w:tr>
+      <w:tr>
+        <w:tc>
+          <w:tcPr>
+            <w:tcW w:type="dxa" w:w="1984"/>
+          </w:tcPr>
+          <w:p>
+            <w:r>
+              <w:t>Données</w:t>
+            </w:r>
+          </w:p>
+        </w:tc>
+        <w:tc>
+          <w:tcPr>
+            <w:tcW w:type="dxa" w:w="7087"/>
+          </w:tcPr>
+          <w:p>
+            <w:r>
+              <w:t>Comment les données sont restaurées (mêmes valeurs ; — = sans objet, par exemple une vue)</w:t>
+            </w:r>
+          </w:p>
+        </w:tc>
+      </w:tr>
+      <w:tr>
+        <w:tc>
+          <w:tcPr>
+            <w:tcW w:type="dxa" w:w="1984"/>
+          </w:tcPr>
+          <w:p>
+            <w:r>
+              <w:t>As code</w:t>
+            </w:r>
+          </w:p>
+        </w:tc>
+        <w:tc>
+          <w:tcPr>
+            <w:tcW w:type="dxa" w:w="7087"/>
+          </w:tcPr>
+          <w:p>
+            <w:r>
+              <w:t>Oui si l'objet a été créé par une identité IaC ou figure dans iac_file</w:t>
+            </w:r>
+          </w:p>
+        </w:tc>
+      </w:tr>
+      <w:tr>
+        <w:tc>
+          <w:tcPr>
+            <w:tcW w:type="dxa" w:w="1984"/>
+          </w:tcPr>
+          <w:p>
+            <w:r>
+              <w:t>Accès backup</w:t>
+            </w:r>
+          </w:p>
+        </w:tc>
+        <w:tc>
+          <w:tcPr>
+            <w:tcW w:type="dxa" w:w="7087"/>
+          </w:tcPr>
+          <w:p>
+            <w:r>
+              <w:t>Oui / NON : droits du compte de backup sur l'objet ; — = non vérifié (backup_principal vide)</w:t>
+            </w:r>
+          </w:p>
+        </w:tc>
+      </w:tr>
+      <w:tr>
+        <w:tc>
+          <w:tcPr>
+            <w:tcW w:type="dxa" w:w="1984"/>
+          </w:tcPr>
+          <w:p>
+            <w:r>
+              <w:t>Dernier backup</w:t>
+            </w:r>
+          </w:p>
+        </w:tc>
+        <w:tc>
+          <w:tcPr>
+            <w:tcW w:type="dxa" w:w="7087"/>
+          </w:tcPr>
+          <w:p>
+            <w:r>
+              <w:t>Résultat de la table au dernier backup : success, skipped (non clonable), error, absent (pas dans la liste du jour)</w:t>
+            </w:r>
+          </w:p>
+        </w:tc>
+      </w:tr>
+      <w:tr>
+        <w:tc>
+          <w:tcPr>
+            <w:tcW w:type="dxa" w:w="1984"/>
+          </w:tcPr>
+          <w:p>
+            <w:r>
+              <w:t>Verdict</w:t>
+            </w:r>
+          </w:p>
+        </w:tc>
+        <w:tc>
+          <w:tcPr>
+            <w:tcW w:type="dxa" w:w="7087"/>
+          </w:tcPr>
+          <w:p>
+            <w:r>
+              <w:t>Synthèse, voir ci-dessous</w:t>
+            </w:r>
+          </w:p>
+        </w:tc>
+      </w:tr>
+      <w:tr>
+        <w:tc>
+          <w:tcPr>
+            <w:tcW w:type="dxa" w:w="1984"/>
+          </w:tcPr>
+          <w:p>
+            <w:r>
+              <w:t>Explication</w:t>
+            </w:r>
+          </w:p>
+        </w:tc>
+        <w:tc>
+          <w:tcPr>
+            <w:tcW w:type="dxa" w:w="7087"/>
+          </w:tcPr>
+          <w:p>
+            <w:r>
+              <w:t>Pourquoi ce verdict, et ce qu'il faut faire le cas échéant</w:t>
+            </w:r>
+          </w:p>
+        </w:tc>
+      </w:tr>
+    </w:tbl>
+    <w:p/>
+    <w:tbl>
+      <w:tblPr>
+        <w:tblStyle w:val="TableGrid"/>
+        <w:tblW w:type="auto" w:w="0"/>
+        <w:jc w:val="left"/>
+        <w:tblLook w:firstColumn="1" w:firstRow="1" w:lastColumn="0" w:lastRow="0" w:noHBand="0" w:noVBand="1" w:val="04A0"/>
+      </w:tblPr>
+      <w:tblGrid>
+        <w:gridCol w:w="2880"/>
+        <w:gridCol w:w="2880"/>
+        <w:gridCol w:w="2880"/>
+      </w:tblGrid>
+      <w:tr>
+        <w:tc>
+          <w:tcPr>
+            <w:tcW w:type="dxa" w:w="2551"/>
+            <w:shd w:val="clear" w:color="auto" w:fill="1F497D"/>
+          </w:tcPr>
+          <w:p>
+            <w:r>
+              <w:rPr>
+                <w:b/>
+                <w:color w:val="FFFFFF"/>
+              </w:rPr>
+              <w:t>Verdict</w:t>
+            </w:r>
+          </w:p>
+        </w:tc>
+        <w:tc>
+          <w:tcPr>
+            <w:tcW w:type="dxa" w:w="3685"/>
+            <w:shd w:val="clear" w:color="auto" w:fill="1F497D"/>
+          </w:tcPr>
+          <w:p>
+            <w:r>
+              <w:rPr>
+                <w:b/>
+                <w:color w:val="FFFFFF"/>
+              </w:rPr>
+              <w:t>Signification</w:t>
+            </w:r>
+          </w:p>
+        </w:tc>
+        <w:tc>
+          <w:tcPr>
+            <w:tcW w:type="dxa" w:w="2835"/>
+            <w:shd w:val="clear" w:color="auto" w:fill="1F497D"/>
+          </w:tcPr>
+          <w:p>
+            <w:r>
+              <w:rPr>
+                <w:b/>
+                <w:color w:val="FFFFFF"/>
+              </w:rPr>
+              <w:t>Action</w:t>
+            </w:r>
+          </w:p>
+        </w:tc>
+      </w:tr>
+      <w:tr>
+        <w:tc>
+          <w:tcPr>
+            <w:tcW w:type="dxa" w:w="2551"/>
+          </w:tcPr>
+          <w:p>
+            <w:r>
+              <w:t>✅ Sauvegardé et restaurable</w:t>
+            </w:r>
+          </w:p>
+        </w:tc>
+        <w:tc>
+          <w:tcPr>
+            <w:tcW w:type="dxa" w:w="3685"/>
+          </w:tcPr>
+          <w:p>
+            <w:r>
+              <w:t>Définition et données couvertes par le backup</w:t>
+            </w:r>
+          </w:p>
+        </w:tc>
+        <w:tc>
+          <w:tcPr>
+            <w:tcW w:type="dxa" w:w="2835"/>
+          </w:tcPr>
+          <w:p>
+            <w:r>
+              <w:t>Aucune</w:t>
+            </w:r>
+          </w:p>
+        </w:tc>
+      </w:tr>
+      <w:tr>
+        <w:tc>
+          <w:tcPr>
+            <w:tcW w:type="dxa" w:w="2551"/>
+          </w:tcPr>
+          <w:p>
+            <w:r>
+              <w:t>🔵 As code (IaC)</w:t>
+            </w:r>
+          </w:p>
+        </w:tc>
+        <w:tc>
+          <w:tcPr>
+            <w:tcW w:type="dxa" w:w="3685"/>
+          </w:tcPr>
+          <w:p>
+            <w:r>
+              <w:t>Recréé par Terraform ou le bundle</w:t>
+            </w:r>
+          </w:p>
+        </w:tc>
+        <w:tc>
+          <w:tcPr>
+            <w:tcW w:type="dxa" w:w="2835"/>
+          </w:tcPr>
+          <w:p>
+            <w:r>
+              <w:t>Vérifier que l'IaC est à jour</w:t>
+            </w:r>
+          </w:p>
+        </w:tc>
+      </w:tr>
+      <w:tr>
+        <w:tc>
+          <w:tcPr>
+            <w:tcW w:type="dxa" w:w="2551"/>
+          </w:tcPr>
+          <w:p>
+            <w:r>
+              <w:t>⚪ Autre moyen</w:t>
+            </w:r>
+          </w:p>
+        </w:tc>
+        <w:tc>
+          <w:tcPr>
+            <w:tcW w:type="dxa" w:w="3685"/>
+          </w:tcPr>
+          <w:p>
+            <w:r>
+              <w:t>Couvert hors backup : Git, recalcul d'un pipeline, données dans la source</w:t>
+            </w:r>
+          </w:p>
+        </w:tc>
+        <w:tc>
+          <w:tcPr>
+            <w:tcW w:type="dxa" w:w="2835"/>
+          </w:tcPr>
+          <w:p>
+            <w:r>
+              <w:t>Documenter le moyen au plan de reprise</w:t>
+            </w:r>
+          </w:p>
+        </w:tc>
+      </w:tr>
+      <w:tr>
+        <w:tc>
+          <w:tcPr>
+            <w:tcW w:type="dxa" w:w="2551"/>
+          </w:tcPr>
+          <w:p>
+            <w:r>
+              <w:t>🟡 Partiel</w:t>
+            </w:r>
+          </w:p>
+        </w:tc>
+        <w:tc>
+          <w:tcPr>
+            <w:tcW w:type="dxa" w:w="3685"/>
+          </w:tcPr>
+          <w:p>
+            <w:r>
+              <w:t>Définition couverte, données non (format non clonable, table protégée)</w:t>
+            </w:r>
+          </w:p>
+        </w:tc>
+        <w:tc>
+          <w:tcPr>
+            <w:tcW w:type="dxa" w:w="2835"/>
+          </w:tcPr>
+          <w:p>
+            <w:r>
+              <w:t>Plan de reconstruction (§9.3)</w:t>
+            </w:r>
+          </w:p>
+        </w:tc>
+      </w:tr>
+      <w:tr>
+        <w:tc>
+          <w:tcPr>
+            <w:tcW w:type="dxa" w:w="2551"/>
+          </w:tcPr>
+          <w:p>
+            <w:r>
+              <w:t>🔴 Couvert mais inaccessible au backup</w:t>
+            </w:r>
+          </w:p>
+        </w:tc>
+        <w:tc>
+          <w:tcPr>
+            <w:tcW w:type="dxa" w:w="3685"/>
+          </w:tcPr>
+          <w:p>
+            <w:r>
+              <w:t>Prévu par le script, mais le compte de backup n'a pas les droits</w:t>
+            </w:r>
+          </w:p>
+        </w:tc>
+        <w:tc>
+          <w:tcPr>
+            <w:tcW w:type="dxa" w:w="2835"/>
+          </w:tcPr>
+          <w:p>
+            <w:r>
+              <w:t>Accorder les droits (§2.5, job dr-backup-grants-sync)</w:t>
+            </w:r>
+          </w:p>
+        </w:tc>
+      </w:tr>
+      <w:tr>
+        <w:tc>
+          <w:tcPr>
+            <w:tcW w:type="dxa" w:w="2551"/>
+          </w:tcPr>
+          <w:p>
+            <w:r>
+              <w:t>🔴 Échec au dernier backup</w:t>
+            </w:r>
+          </w:p>
+        </w:tc>
+        <w:tc>
+          <w:tcPr>
+            <w:tcW w:type="dxa" w:w="3685"/>
+          </w:tcPr>
+          <w:p>
+            <w:r>
+              <w:t>Table en erreur ou non copiée au dernier backup</w:t>
+            </w:r>
+          </w:p>
+        </w:tc>
+        <w:tc>
+          <w:tcPr>
+            <w:tcW w:type="dxa" w:w="2835"/>
+          </w:tcPr>
+          <w:p>
+            <w:r>
+              <w:t>Lire la cause dans le rapport du backup du jour</w:t>
+            </w:r>
+          </w:p>
+        </w:tc>
+      </w:tr>
+      <w:tr>
+        <w:tc>
+          <w:tcPr>
+            <w:tcW w:type="dxa" w:w="2551"/>
+          </w:tcPr>
+          <w:p>
+            <w:r>
+              <w:t>🔴 Non couvert</w:t>
+            </w:r>
+          </w:p>
+        </w:tc>
+        <w:tc>
+          <w:tcPr>
+            <w:tcW w:type="dxa" w:w="3685"/>
+          </w:tcPr>
+          <w:p>
+            <w:r>
+              <w:t>Ni le backup ni l'IaC ne le recréent</w:t>
+            </w:r>
+          </w:p>
+        </w:tc>
+        <w:tc>
+          <w:tcPr>
+            <w:tcW w:type="dxa" w:w="2835"/>
+          </w:tcPr>
+          <w:p>
+            <w:r>
+              <w:t>Le couvrir en IaC, ou accepter le risque</w:t>
+            </w:r>
+          </w:p>
+        </w:tc>
+      </w:tr>
+      <w:tr>
+        <w:tc>
+          <w:tcPr>
+            <w:tcW w:type="dxa" w:w="2551"/>
+          </w:tcPr>
+          <w:p>
+            <w:r>
+              <w:t>⚫ Exclu volontairement</w:t>
+            </w:r>
+          </w:p>
+        </w:tc>
+        <w:tc>
+          <w:tcPr>
+            <w:tcW w:type="dxa" w:w="3685"/>
+          </w:tcPr>
+          <w:p>
+            <w:r>
+              <w:t>Catalog listé dans excluded_catalogs</w:t>
+            </w:r>
+          </w:p>
+        </w:tc>
+        <w:tc>
+          <w:tcPr>
+            <w:tcW w:type="dxa" w:w="2835"/>
+          </w:tcPr>
+          <w:p>
+            <w:r>
+              <w:t>Aucune</w:t>
+            </w:r>
+          </w:p>
+        </w:tc>
+      </w:tr>
+    </w:tbl>
+    <w:p/>
+    <w:p>
+      <w:pPr>
+        <w:pStyle w:val="Heading2"/>
+        <w:jc w:val="left"/>
+      </w:pPr>
+      <w:r>
+        <w:rPr>
+          <w:color w:val="1F497D"/>
+        </w:rPr>
+        <w:t>3.5 Visibilité des tables protégées pour le compte de backup</w:t>
+      </w:r>
+    </w:p>
+    <w:p>
+      <w:r>
+        <w:t>DEEP CLONE refuse les tables portant un filtre de lignes ou un masque de colonnes, quel que soit le compte : leurs données ne sont pas sauvegardées (verdict « Partiel » du §3.4). Pour savoir si une copie par lecture de ces tables serait possible, le notebook diag_04_protected_tables.py appelle chaque fonction de filtre et de masque avec des valeurs de test, sous l'identité qui l'exécute.</w:t>
+      </w:r>
+    </w:p>
+    <w:p>
+      <w:pPr>
+        <w:ind w:left="283"/>
+      </w:pPr>
+      <w:r>
+        <w:rPr>
+          <w:b/>
+          <w:color w:val="C00000"/>
+          <w:sz w:val="20"/>
+        </w:rPr>
+        <w:t>Attention : le résultat vaut pour le compte qui exécute le notebook. Le lancer sous l'identité du job de backup : Workflows → créer un job à une tâche (notebook diag_04_protected_tables), puis dans les paramètres du job, « Run as » = le service principal du backup. Lancé avec un compte administrateur, il indiquerait ce que voit cet administrateur, pas le backup.</w:t>
+      </w:r>
+    </w:p>
+    <w:tbl>
+      <w:tblPr>
+        <w:tblStyle w:val="TableGrid"/>
+        <w:tblW w:type="auto" w:w="0"/>
+        <w:jc w:val="left"/>
+        <w:tblLook w:firstColumn="1" w:firstRow="1" w:lastColumn="0" w:lastRow="0" w:noHBand="0" w:noVBand="1" w:val="04A0"/>
+      </w:tblPr>
+      <w:tblGrid>
+        <w:gridCol w:w="4320"/>
+        <w:gridCol w:w="4320"/>
+      </w:tblGrid>
+      <w:tr>
+        <w:tc>
+          <w:tcPr>
+            <w:tcW w:type="dxa" w:w="2268"/>
+            <w:shd w:val="clear" w:color="auto" w:fill="1F497D"/>
+          </w:tcPr>
+          <w:p>
+            <w:r>
+              <w:rPr>
+                <w:b/>
+                <w:color w:val="FFFFFF"/>
+              </w:rPr>
+              <w:t>Paramètre</w:t>
+            </w:r>
+          </w:p>
+        </w:tc>
+        <w:tc>
+          <w:tcPr>
+            <w:tcW w:type="dxa" w:w="6803"/>
+            <w:shd w:val="clear" w:color="auto" w:fill="1F497D"/>
+          </w:tcPr>
+          <w:p>
+            <w:r>
+              <w:rPr>
+                <w:b/>
+                <w:color w:val="FFFFFF"/>
+              </w:rPr>
+              <w:t>Rôle</w:t>
+            </w:r>
+          </w:p>
+        </w:tc>
+      </w:tr>
+      <w:tr>
+        <w:tc>
+          <w:tcPr>
+            <w:tcW w:type="dxa" w:w="2268"/>
+          </w:tcPr>
+          <w:p>
+            <w:r>
+              <w:t>catalog_filter</w:t>
+            </w:r>
+          </w:p>
+        </w:tc>
+        <w:tc>
+          <w:tcPr>
+            <w:tcW w:type="dxa" w:w="6803"/>
+          </w:tcPr>
+          <w:p>
+            <w:r>
+              <w:t>Catalogs à contrôler, séparés par des virgules (vide = tous)</w:t>
+            </w:r>
+          </w:p>
+        </w:tc>
+      </w:tr>
+      <w:tr>
+        <w:tc>
+          <w:tcPr>
+            <w:tcW w:type="dxa" w:w="2268"/>
+          </w:tcPr>
+          <w:p>
+            <w:r>
+              <w:t>output_dir</w:t>
+            </w:r>
+          </w:p>
+        </w:tc>
+        <w:tc>
+          <w:tcPr>
+            <w:tcW w:type="dxa" w:w="6803"/>
+          </w:tcPr>
+          <w:p>
+            <w:r>
+              <w:t>Dossier du workspace où écrire un rapport HTML (vide = résultat affiché seulement)</w:t>
+            </w:r>
+          </w:p>
+        </w:tc>
+      </w:tr>
+    </w:tbl>
+    <w:p/>
+    <w:p>
+      <w:r>
+        <w:t>Prérequis : USE CATALOG sur le catalog system et EXECUTE sur les fonctions de filtre et de masque.</w:t>
+      </w:r>
+    </w:p>
+    <w:tbl>
+      <w:tblPr>
+        <w:tblStyle w:val="TableGrid"/>
+        <w:tblW w:type="auto" w:w="0"/>
+        <w:jc w:val="left"/>
+        <w:tblLook w:firstColumn="1" w:firstRow="1" w:lastColumn="0" w:lastRow="0" w:noHBand="0" w:noVBand="1" w:val="04A0"/>
+      </w:tblPr>
+      <w:tblGrid>
+        <w:gridCol w:w="4320"/>
+        <w:gridCol w:w="4320"/>
+      </w:tblGrid>
+      <w:tr>
+        <w:tc>
+          <w:tcPr>
+            <w:tcW w:type="dxa" w:w="2268"/>
+            <w:shd w:val="clear" w:color="auto" w:fill="1F497D"/>
+          </w:tcPr>
+          <w:p>
+            <w:r>
+              <w:rPr>
+                <w:b/>
+                <w:color w:val="FFFFFF"/>
+              </w:rPr>
+              <w:t>Verdict</w:t>
+            </w:r>
+          </w:p>
+        </w:tc>
+        <w:tc>
+          <w:tcPr>
+            <w:tcW w:type="dxa" w:w="6803"/>
+            <w:shd w:val="clear" w:color="auto" w:fill="1F497D"/>
+          </w:tcPr>
+          <w:p>
+            <w:r>
+              <w:rPr>
+                <w:b/>
+                <w:color w:val="FFFFFF"/>
+              </w:rPr>
+              <w:t>Signification</w:t>
+            </w:r>
+          </w:p>
+        </w:tc>
+      </w:tr>
+      <w:tr>
+        <w:tc>
+          <w:tcPr>
+            <w:tcW w:type="dxa" w:w="2268"/>
+          </w:tcPr>
+          <w:p>
+            <w:r>
+              <w:t>COMPLETE</w:t>
+            </w:r>
+          </w:p>
+        </w:tc>
+        <w:tc>
+          <w:tcPr>
+            <w:tcW w:type="dxa" w:w="6803"/>
+          </w:tcPr>
+          <w:p>
+            <w:r>
+              <w:t>Le compte voit toutes les lignes et les valeurs réelles : une copie par lecture serait complète</w:t>
+            </w:r>
+          </w:p>
+        </w:tc>
+      </w:tr>
+      <w:tr>
+        <w:tc>
+          <w:tcPr>
+            <w:tcW w:type="dxa" w:w="2268"/>
+          </w:tcPr>
+          <w:p>
+            <w:r>
+              <w:t>LIGNES_FILTREES</w:t>
+            </w:r>
+          </w:p>
+        </w:tc>
+        <w:tc>
+          <w:tcPr>
+            <w:tcW w:type="dxa" w:w="6803"/>
+          </w:tcPr>
+          <w:p>
+            <w:r>
+              <w:t>Le filtre cache des lignes à ce compte : une copie serait incomplète</w:t>
+            </w:r>
+          </w:p>
+        </w:tc>
+      </w:tr>
+      <w:tr>
+        <w:tc>
+          <w:tcPr>
+            <w:tcW w:type="dxa" w:w="2268"/>
+          </w:tcPr>
+          <w:p>
+            <w:r>
+              <w:t>VALEURS_MASQUEES</w:t>
+            </w:r>
+          </w:p>
+        </w:tc>
+        <w:tc>
+          <w:tcPr>
+            <w:tcW w:type="dxa" w:w="6803"/>
+          </w:tcPr>
+          <w:p>
+            <w:r>
+              <w:t>Des colonnes sont masquées pour ce compte : une copie contiendrait des valeurs masquées</w:t>
+            </w:r>
+          </w:p>
+        </w:tc>
+      </w:tr>
+      <w:tr>
+        <w:tc>
+          <w:tcPr>
+            <w:tcW w:type="dxa" w:w="2268"/>
+          </w:tcPr>
+          <w:p>
+            <w:r>
+              <w:t>INDETERMINE</w:t>
+            </w:r>
+          </w:p>
+        </w:tc>
+        <w:tc>
+          <w:tcPr>
+            <w:tcW w:type="dxa" w:w="6803"/>
+          </w:tcPr>
+          <w:p>
+            <w:r>
+              <w:t>Une fonction n'a pas pu être appelée (droit EXECUTE, type non testable) : vérifier à la main</w:t>
+            </w:r>
+          </w:p>
+        </w:tc>
+      </w:tr>
+    </w:tbl>
+    <w:p/>
+    <w:p>
+      <w:pPr>
+        <w:ind w:left="283"/>
+      </w:pPr>
+      <w:r>
+        <w:rPr>
+          <w:i/>
+          <w:color w:val="707070"/>
+          <w:sz w:val="20"/>
+        </w:rPr>
+        <w:t>Note : is_account_group_member() teste un groupe du compte Databricks, pas un groupe local au workspace. Une exemption écrite is_account_group_member('admins') ne s'applique pas à un membre du groupe admins du workspace. Pour exempter le compte de backup, utiliser un groupe de compte.</w:t>
+      </w:r>
+    </w:p>
+    <w:p>
+      <w:r>
+        <w:t>Vérification manuelle d'une table, avec un compte administrateur :</w:t>
+      </w:r>
+    </w:p>
+    <w:p>
+      <w:pPr>
+        <w:spacing w:before="40" w:after="40"/>
+        <w:ind w:left="283"/>
+        <w:shd w:val="clear" w:color="auto" w:fill="F0F0F0"/>
+      </w:pPr>
+      <w:r>
+        <w:rPr>
+          <w:rFonts w:ascii="Courier New" w:hAnsi="Courier New"/>
+          <w:color w:val="1F497D"/>
+          <w:sz w:val="18"/>
+        </w:rPr>
+        <w:t>SELECT * FROM system.information_schema.row_filters   WHERE table_name = '&lt;table&gt;';</w:t>
+        <w:br/>
+        <w:t>SELECT * FROM system.information_schema.column_masks  WHERE table_name = '&lt;table&gt;';</w:t>
+        <w:br/>
+        <w:t>DESCRIBE FUNCTION EXTENDED &lt;catalog&gt;.&lt;schema&gt;.&lt;fonction&gt;;</w:t>
       </w:r>
     </w:p>
     <w:p>
@@ -5962,6 +6863,38 @@
           </w:tcPr>
           <w:p>
             <w:r>
+              <w:t>dr-backup-grants-sync</w:t>
+            </w:r>
+          </w:p>
+        </w:tc>
+        <w:tc>
+          <w:tcPr>
+            <w:tcW w:type="dxa" w:w="3969"/>
+          </w:tcPr>
+          <w:p>
+            <w:r>
+              <w:t>Chaque nuit à 00:30 UTC, avant le backup</w:t>
+            </w:r>
+          </w:p>
+        </w:tc>
+        <w:tc>
+          <w:tcPr>
+            <w:tcW w:type="dxa" w:w="2551"/>
+          </w:tcPr>
+          <w:p>
+            <w:r>
+              <w:t>30 minutes</w:t>
+            </w:r>
+          </w:p>
+        </w:tc>
+      </w:tr>
+      <w:tr>
+        <w:tc>
+          <w:tcPr>
+            <w:tcW w:type="dxa" w:w="2551"/>
+          </w:tcPr>
+          <w:p>
+            <w:r>
               <w:t>dr-backup-daily</w:t>
             </w:r>
           </w:p>
@@ -6021,6 +6954,52 @@
       </w:tr>
     </w:tbl>
     <w:p/>
+    <w:p>
+      <w:pPr>
+        <w:pStyle w:val="Heading3"/>
+        <w:jc w:val="left"/>
+      </w:pPr>
+      <w:r>
+        <w:rPr>
+          <w:color w:val="1F497D"/>
+        </w:rPr>
+        <w:t>Synchronisation automatique des droits (dr-backup-grants-sync)</w:t>
+      </w:r>
+    </w:p>
+    <w:p>
+      <w:r>
+        <w:t>Ce job rend le backup autonome face aux nouveaux catalogs : il compare chaque jour les droits du compte de backup à ceux requis (USE CATALOG, USE SCHEMA, BROWSE, SELECT, READ VOLUME, EXECUTE sur chaque catalog standard ; READ FILES et WRITE FILES sur l'External Location ; USE CATALOG sur system). Les droits posés au niveau du catalog couvrent tous ses objets, présents et futurs : seul un nouveau catalog est à rattraper.</w:t>
+      </w:r>
+    </w:p>
+    <w:p>
+      <w:pPr>
+        <w:pStyle w:val="ListBullet"/>
+      </w:pPr>
+      <w:r>
+        <w:t>Mode report (défaut) : constat seul. En cas d'écart, le job échoue, ce qui déclenche la notification ; sa sortie liste chaque objet (OK / manquant) et les GRANT à accorder.</w:t>
+      </w:r>
+    </w:p>
+    <w:p>
+      <w:pPr>
+        <w:pStyle w:val="ListBullet"/>
+      </w:pPr>
+      <w:r>
+        <w:t>Mode apply : le job accorde lui-même les droits manquants. C'est le mode à retenir en exploitation, une fois le mode report validé sur un run.</w:t>
+      </w:r>
+    </w:p>
+    <w:p>
+      <w:pPr>
+        <w:ind w:left="283"/>
+      </w:pPr>
+      <w:r>
+        <w:rPr>
+          <w:i/>
+          <w:color w:val="707070"/>
+          <w:sz w:val="20"/>
+        </w:rPr>
+        <w:t>Note : le job s'exécute avec l'identité qui déploie le bundle, qui doit être admin du metastore pour accorder les droits. Préférer un service principal d'administration à un compte nominatif, pour ne pas dépendre d'une personne.</w:t>
+      </w:r>
+    </w:p>
     <w:p>
       <w:pPr>
         <w:ind w:left="283"/>
@@ -6876,6 +7855,271 @@
       </w:r>
     </w:p>
     <w:p>
+      <w:pPr>
+        <w:pStyle w:val="Heading2"/>
+        <w:jc w:val="left"/>
+      </w:pPr>
+      <w:r>
+        <w:rPr>
+          <w:color w:val="1F497D"/>
+        </w:rPr>
+        <w:t>9.3 Tables dont les données ne sont pas sauvegardées : plan de reconstruction</w:t>
+      </w:r>
+    </w:p>
+    <w:p>
+      <w:r>
+        <w:t>Certaines tables sont recréées vides par la restauration : tables à filtre de lignes ou masque de colonnes, formats non clonables. Elles apparaissent en « Partiel » dans le rapport de couverture (§3.4) et dans la liste « Tables non sauvegardées » du rapport de chaque backup. Leur reconstruction revient à l'équipe propriétaire de la table, en relançant le traitement qui l'alimente depuis sa source ; la solution restaure la définition de la table et celle du job ou du pipeline qui l'alimente.</w:t>
+      </w:r>
+    </w:p>
+    <w:p>
+      <w:r>
+        <w:t>Retrouver le traitement qui écrit dans la table (lignage Unity Catalog) :</w:t>
+      </w:r>
+    </w:p>
+    <w:p>
+      <w:pPr>
+        <w:spacing w:before="40" w:after="40"/>
+        <w:ind w:left="283"/>
+        <w:shd w:val="clear" w:color="auto" w:fill="F0F0F0"/>
+      </w:pPr>
+      <w:r>
+        <w:rPr>
+          <w:rFonts w:ascii="Courier New" w:hAnsi="Courier New"/>
+          <w:color w:val="1F497D"/>
+          <w:sz w:val="18"/>
+        </w:rPr>
+        <w:t>SELECT DISTINCT entity_type, entity_id, created_by, max(event_time) AS derniere_ecriture</w:t>
+        <w:br/>
+        <w:t>FROM system.access.table_lineage</w:t>
+        <w:br/>
+        <w:t>WHERE target_table_full_name = '&lt;catalog&gt;.&lt;schema&gt;.&lt;table&gt;'</w:t>
+        <w:br/>
+        <w:t>GROUP BY ALL ORDER BY derniere_ecriture DESC;</w:t>
+      </w:r>
+    </w:p>
+    <w:p>
+      <w:r>
+        <w:t>entity_type et entity_id désignent le job, le pipeline ou le notebook qui écrit dans la table. L'onglet Lineage de la table dans Catalog Explorer donne la même information. Accès requis aux tables système system.access.</w:t>
+      </w:r>
+    </w:p>
+    <w:p>
+      <w:pPr>
+        <w:ind w:left="283"/>
+      </w:pPr>
+      <w:r>
+        <w:rPr>
+          <w:b/>
+          <w:color w:val="C00000"/>
+          <w:sz w:val="20"/>
+        </w:rPr>
+        <w:t>Attention : vérifier que la source permet un rechargement complet. Un chargement incrémental, ou une source qui purge son historique, ne reconstruit qu'une partie de la table. Dans ce cas, envisager une copie par lecture (si diag_04 donne COMPLETE pour le compte de backup) ou porter le filtre par une vue plutôt que par la table, pour qu'elle redevienne clonable.</w:t>
+      </w:r>
+    </w:p>
+    <w:p>
+      <w:r>
+        <w:t>Fiche à tenir au plan de reprise pour chacune de ces tables :</w:t>
+      </w:r>
+    </w:p>
+    <w:tbl>
+      <w:tblPr>
+        <w:tblStyle w:val="TableGrid"/>
+        <w:tblW w:type="auto" w:w="0"/>
+        <w:jc w:val="left"/>
+        <w:tblLook w:firstColumn="1" w:firstRow="1" w:lastColumn="0" w:lastRow="0" w:noHBand="0" w:noVBand="1" w:val="04A0"/>
+      </w:tblPr>
+      <w:tblGrid>
+        <w:gridCol w:w="4320"/>
+        <w:gridCol w:w="4320"/>
+      </w:tblGrid>
+      <w:tr>
+        <w:tc>
+          <w:tcPr>
+            <w:tcW w:type="dxa" w:w="2268"/>
+            <w:shd w:val="clear" w:color="auto" w:fill="1F497D"/>
+          </w:tcPr>
+          <w:p>
+            <w:r>
+              <w:rPr>
+                <w:b/>
+                <w:color w:val="FFFFFF"/>
+              </w:rPr>
+              <w:t>Rubrique</w:t>
+            </w:r>
+          </w:p>
+        </w:tc>
+        <w:tc>
+          <w:tcPr>
+            <w:tcW w:type="dxa" w:w="6803"/>
+            <w:shd w:val="clear" w:color="auto" w:fill="1F497D"/>
+          </w:tcPr>
+          <w:p>
+            <w:r>
+              <w:rPr>
+                <w:b/>
+                <w:color w:val="FFFFFF"/>
+              </w:rPr>
+              <w:t>Contenu</w:t>
+            </w:r>
+          </w:p>
+        </w:tc>
+      </w:tr>
+      <w:tr>
+        <w:tc>
+          <w:tcPr>
+            <w:tcW w:type="dxa" w:w="2268"/>
+          </w:tcPr>
+          <w:p>
+            <w:r>
+              <w:t>Table</w:t>
+            </w:r>
+          </w:p>
+        </w:tc>
+        <w:tc>
+          <w:tcPr>
+            <w:tcW w:type="dxa" w:w="6803"/>
+          </w:tcPr>
+          <w:p>
+            <w:r>
+              <w:t>catalog.schema.table</w:t>
+            </w:r>
+          </w:p>
+        </w:tc>
+      </w:tr>
+      <w:tr>
+        <w:tc>
+          <w:tcPr>
+            <w:tcW w:type="dxa" w:w="2268"/>
+          </w:tcPr>
+          <w:p>
+            <w:r>
+              <w:t>Raison</w:t>
+            </w:r>
+          </w:p>
+        </w:tc>
+        <w:tc>
+          <w:tcPr>
+            <w:tcW w:type="dxa" w:w="6803"/>
+          </w:tcPr>
+          <w:p>
+            <w:r>
+              <w:t>Filtre de lignes / masque de colonnes / format non clonable</w:t>
+            </w:r>
+          </w:p>
+        </w:tc>
+      </w:tr>
+      <w:tr>
+        <w:tc>
+          <w:tcPr>
+            <w:tcW w:type="dxa" w:w="2268"/>
+          </w:tcPr>
+          <w:p>
+            <w:r>
+              <w:t>Responsable</w:t>
+            </w:r>
+          </w:p>
+        </w:tc>
+        <w:tc>
+          <w:tcPr>
+            <w:tcW w:type="dxa" w:w="6803"/>
+          </w:tcPr>
+          <w:p>
+            <w:r>
+              <w:t>Équipe propriétaire et contact nominatif</w:t>
+            </w:r>
+          </w:p>
+        </w:tc>
+      </w:tr>
+      <w:tr>
+        <w:tc>
+          <w:tcPr>
+            <w:tcW w:type="dxa" w:w="2268"/>
+          </w:tcPr>
+          <w:p>
+            <w:r>
+              <w:t>Traitement à relancer</w:t>
+            </w:r>
+          </w:p>
+        </w:tc>
+        <w:tc>
+          <w:tcPr>
+            <w:tcW w:type="dxa" w:w="6803"/>
+          </w:tcPr>
+          <w:p>
+            <w:r>
+              <w:t>Job ou pipeline, paramètres d'un chargement complet</w:t>
+            </w:r>
+          </w:p>
+        </w:tc>
+      </w:tr>
+      <w:tr>
+        <w:tc>
+          <w:tcPr>
+            <w:tcW w:type="dxa" w:w="2268"/>
+          </w:tcPr>
+          <w:p>
+            <w:r>
+              <w:t>Source</w:t>
+            </w:r>
+          </w:p>
+        </w:tc>
+        <w:tc>
+          <w:tcPr>
+            <w:tcW w:type="dxa" w:w="6803"/>
+          </w:tcPr>
+          <w:p>
+            <w:r>
+              <w:t>Système d'origine et profondeur d'historique disponible</w:t>
+            </w:r>
+          </w:p>
+        </w:tc>
+      </w:tr>
+      <w:tr>
+        <w:tc>
+          <w:tcPr>
+            <w:tcW w:type="dxa" w:w="2268"/>
+          </w:tcPr>
+          <w:p>
+            <w:r>
+              <w:t>Données perdues</w:t>
+            </w:r>
+          </w:p>
+        </w:tc>
+        <w:tc>
+          <w:tcPr>
+            <w:tcW w:type="dxa" w:w="6803"/>
+          </w:tcPr>
+          <w:p>
+            <w:r>
+              <w:t>Ce que la reconstruction ne retrouvera pas</w:t>
+            </w:r>
+          </w:p>
+        </w:tc>
+      </w:tr>
+      <w:tr>
+        <w:tc>
+          <w:tcPr>
+            <w:tcW w:type="dxa" w:w="2268"/>
+          </w:tcPr>
+          <w:p>
+            <w:r>
+              <w:t>Durée estimée</w:t>
+            </w:r>
+          </w:p>
+        </w:tc>
+        <w:tc>
+          <w:tcPr>
+            <w:tcW w:type="dxa" w:w="6803"/>
+          </w:tcPr>
+          <w:p>
+            <w:r>
+              <w:t>Temps de reconstruction</w:t>
+            </w:r>
+          </w:p>
+        </w:tc>
+      </w:tr>
+    </w:tbl>
+    <w:p/>
+    <w:p>
       <w:r>
         <w:br w:type="page"/>
       </w:r>
@@ -7176,7 +8420,7 @@
           </w:tcPr>
           <w:p>
             <w:r>
-              <w:t>OPTIMIZE réalisé sur les tables signalées</w:t>
+              <w:t>Rapport de couverture lu, objets « à traiter » pris en charge</w:t>
             </w:r>
           </w:p>
         </w:tc>
@@ -7186,7 +8430,7 @@
           </w:tcPr>
           <w:p>
             <w:r>
-              <w:t>3.3</w:t>
+              <w:t>3.4</w:t>
             </w:r>
           </w:p>
         </w:tc>
@@ -7206,7 +8450,7 @@
           </w:tcPr>
           <w:p>
             <w:r>
-              <w:t>databricks.yml adapté à l'environnement</w:t>
+              <w:t>Tables protégées contrôlées sous l'identité du backup (diag_04)</w:t>
             </w:r>
           </w:p>
         </w:tc>
@@ -7216,7 +8460,7 @@
           </w:tcPr>
           <w:p>
             <w:r>
-              <w:t>4.2</w:t>
+              <w:t>3.5</w:t>
             </w:r>
           </w:p>
         </w:tc>
@@ -7236,7 +8480,7 @@
           </w:tcPr>
           <w:p>
             <w:r>
-              <w:t>Profil CLI configuré et connexion vérifiée</w:t>
+              <w:t>OPTIMIZE réalisé sur les tables signalées</w:t>
             </w:r>
           </w:p>
         </w:tc>
@@ -7246,7 +8490,7 @@
           </w:tcPr>
           <w:p>
             <w:r>
-              <w:t>4.3</w:t>
+              <w:t>3.3</w:t>
             </w:r>
           </w:p>
         </w:tc>
@@ -7266,7 +8510,7 @@
           </w:tcPr>
           <w:p>
             <w:r>
-              <w:t>Test de connectivité de bout en bout réussi</w:t>
+              <w:t>databricks.yml adapté à l'environnement</w:t>
             </w:r>
           </w:p>
         </w:tc>
@@ -7276,7 +8520,7 @@
           </w:tcPr>
           <w:p>
             <w:r>
-              <w:t>4.4</w:t>
+              <w:t>4.2</w:t>
             </w:r>
           </w:p>
         </w:tc>
@@ -7296,7 +8540,7 @@
           </w:tcPr>
           <w:p>
             <w:r>
-              <w:t>Bundle déployé, deux jobs visibles dans Workflows</w:t>
+              <w:t>Profil CLI configuré et connexion vérifiée</w:t>
             </w:r>
           </w:p>
         </w:tc>
@@ -7306,7 +8550,7 @@
           </w:tcPr>
           <w:p>
             <w:r>
-              <w:t>4.5</w:t>
+              <w:t>4.3</w:t>
             </w:r>
           </w:p>
         </w:tc>
@@ -7326,7 +8570,7 @@
           </w:tcPr>
           <w:p>
             <w:r>
-              <w:t>Cluster dimensionné selon le nombre de tables</w:t>
+              <w:t>Test de connectivité de bout en bout réussi</w:t>
             </w:r>
           </w:p>
         </w:tc>
@@ -7336,7 +8580,7 @@
           </w:tcPr>
           <w:p>
             <w:r>
-              <w:t>5.1</w:t>
+              <w:t>4.4</w:t>
             </w:r>
           </w:p>
         </w:tc>
@@ -7356,7 +8600,7 @@
           </w:tcPr>
           <w:p>
             <w:r>
-              <w:t>Premier backup exécuté manuellement</w:t>
+              <w:t>Bundle déployé, deux jobs visibles dans Workflows</w:t>
             </w:r>
           </w:p>
         </w:tc>
@@ -7366,7 +8610,7 @@
           </w:tcPr>
           <w:p>
             <w:r>
-              <w:t>5.4</w:t>
+              <w:t>4.5</w:t>
             </w:r>
           </w:p>
         </w:tc>
@@ -7386,7 +8630,7 @@
           </w:tcPr>
           <w:p>
             <w:r>
-              <w:t>Les 8 points de validation sont vérifiés</w:t>
+              <w:t>Cluster dimensionné selon le nombre de tables</w:t>
             </w:r>
           </w:p>
         </w:tc>
@@ -7396,7 +8640,7 @@
           </w:tcPr>
           <w:p>
             <w:r>
-              <w:t>7</w:t>
+              <w:t>5.1</w:t>
             </w:r>
           </w:p>
         </w:tc>
@@ -7416,7 +8660,7 @@
           </w:tcPr>
           <w:p>
             <w:r>
-              <w:t>Alerte d'échec testée volontairement</w:t>
+              <w:t>Premier backup exécuté manuellement</w:t>
             </w:r>
           </w:p>
         </w:tc>
@@ -7426,7 +8670,7 @@
           </w:tcPr>
           <w:p>
             <w:r>
-              <w:t>8</w:t>
+              <w:t>5.4</w:t>
             </w:r>
           </w:p>
         </w:tc>
@@ -7446,7 +8690,7 @@
           </w:tcPr>
           <w:p>
             <w:r>
-              <w:t>Restauration testée en simulation</w:t>
+              <w:t>Les 8 points de validation sont vérifiés</w:t>
             </w:r>
           </w:p>
         </w:tc>
@@ -7456,7 +8700,7 @@
           </w:tcPr>
           <w:p>
             <w:r>
-              <w:t>9</w:t>
+              <w:t>7</w:t>
             </w:r>
           </w:p>
         </w:tc>
@@ -7476,6 +8720,96 @@
           </w:tcPr>
           <w:p>
             <w:r>
+              <w:t>Alerte d'échec testée volontairement</w:t>
+            </w:r>
+          </w:p>
+        </w:tc>
+        <w:tc>
+          <w:tcPr>
+            <w:tcW w:type="dxa" w:w="1984"/>
+          </w:tcPr>
+          <w:p>
+            <w:r>
+              <w:t>8</w:t>
+            </w:r>
+          </w:p>
+        </w:tc>
+      </w:tr>
+      <w:tr>
+        <w:tc>
+          <w:tcPr>
+            <w:tcW w:type="dxa" w:w="850"/>
+          </w:tcPr>
+          <w:p>
+            <w:r/>
+          </w:p>
+        </w:tc>
+        <w:tc>
+          <w:tcPr>
+            <w:tcW w:type="dxa" w:w="6236"/>
+          </w:tcPr>
+          <w:p>
+            <w:r>
+              <w:t>Restauration testée en simulation</w:t>
+            </w:r>
+          </w:p>
+        </w:tc>
+        <w:tc>
+          <w:tcPr>
+            <w:tcW w:type="dxa" w:w="1984"/>
+          </w:tcPr>
+          <w:p>
+            <w:r>
+              <w:t>9</w:t>
+            </w:r>
+          </w:p>
+        </w:tc>
+      </w:tr>
+      <w:tr>
+        <w:tc>
+          <w:tcPr>
+            <w:tcW w:type="dxa" w:w="850"/>
+          </w:tcPr>
+          <w:p>
+            <w:r/>
+          </w:p>
+        </w:tc>
+        <w:tc>
+          <w:tcPr>
+            <w:tcW w:type="dxa" w:w="6236"/>
+          </w:tcPr>
+          <w:p>
+            <w:r>
+              <w:t>dr-backup-grants-sync validé en report puis passé en apply</w:t>
+            </w:r>
+          </w:p>
+        </w:tc>
+        <w:tc>
+          <w:tcPr>
+            <w:tcW w:type="dxa" w:w="1984"/>
+          </w:tcPr>
+          <w:p>
+            <w:r>
+              <w:t>8</w:t>
+            </w:r>
+          </w:p>
+        </w:tc>
+      </w:tr>
+      <w:tr>
+        <w:tc>
+          <w:tcPr>
+            <w:tcW w:type="dxa" w:w="850"/>
+          </w:tcPr>
+          <w:p>
+            <w:r/>
+          </w:p>
+        </w:tc>
+        <w:tc>
+          <w:tcPr>
+            <w:tcW w:type="dxa" w:w="6236"/>
+          </w:tcPr>
+          <w:p>
+            <w:r>
               <w:t>Planifications activées</w:t>
             </w:r>
           </w:p>
@@ -7487,6 +8821,36 @@
           <w:p>
             <w:r>
               <w:t>8</w:t>
+            </w:r>
+          </w:p>
+        </w:tc>
+      </w:tr>
+      <w:tr>
+        <w:tc>
+          <w:tcPr>
+            <w:tcW w:type="dxa" w:w="850"/>
+          </w:tcPr>
+          <w:p>
+            <w:r/>
+          </w:p>
+        </w:tc>
+        <w:tc>
+          <w:tcPr>
+            <w:tcW w:type="dxa" w:w="6236"/>
+          </w:tcPr>
+          <w:p>
+            <w:r>
+              <w:t>Fiches de reconstruction rédigées pour les tables non sauvegardées</w:t>
+            </w:r>
+          </w:p>
+        </w:tc>
+        <w:tc>
+          <w:tcPr>
+            <w:tcW w:type="dxa" w:w="1984"/>
+          </w:tcPr>
+          <w:p>
+            <w:r>
+              <w:t>9.3</w:t>
             </w:r>
           </w:p>
         </w:tc>

</xml_diff>

<commit_message>
docs: runbook de restauration livré en .docx, guide de restauration retiré, renvois croisés
- generate_runbook.py : runbook_restauration_complete.md (source unique de la procédure) mis
  en forme avec la charte commune → DR_Backup_Runbook_Restauration_v4.2.docx
- runbook : valeurs d'environnement KeyIT remplacées par <compte> / <container> / <workspace>,
  section « Documents de référence », tableau des widgets réparé (ligne conflict_mode égarée,
  skip / replace), notebooks ouverts depuis le dossier du bundle, snapshots hebdomadaires
  signalés comme anciens
- guide §9 renvoie au runbook ; liste des documents de l'archive ; notes de version : tableau
  des documents livrés
- DR_Backup_Guide_Restauration.docx (sans générateur, non mis à jour depuis juillet) n'est plus
  livré

Co-Authored-By: Claude Opus 5.5 <noreply@anthropic.com>
</commit_message>
<xml_diff>
--- a/docs/DR_Backup_Guide_Deploiement_v4.2.docx
+++ b/docs/DR_Backup_Guide_Deploiement_v4.2.docx
@@ -3693,7 +3693,7 @@
         <w:br/>
         <w:t>scripts/                  utilitaires de restauration hors Databricks</w:t>
         <w:br/>
-        <w:t>docs/                     guides de deploiement et de restauration</w:t>
+        <w:t>docs/                     guide de deploiement, runbook de restauration, notes de version</w:t>
       </w:r>
     </w:p>
     <w:p>
@@ -7032,7 +7032,7 @@
     </w:p>
     <w:p>
       <w:r>
-        <w:t>La procédure détaillée figure dans le document DR Backup — Guide de restauration, livré avec cette solution. Ce chapitre en donne la vue d'ensemble.</w:t>
+        <w:t>La procédure détaillée figure dans le document DR Backup — Runbook de restauration (DR_Backup_Runbook_Restauration_v4.2.docx), livré avec cette solution : paramètres de chaque notebook, scénarios de restauration partielle et totale, comportement quand un objet existe déjà. Ce chapitre en donne la vue d'ensemble.</w:t>
       </w:r>
     </w:p>
     <w:tbl>

</xml_diff>

<commit_message>
docs: incohérences corrigées dans les trois documents livrés
Guide : trois jobs (et non deux), droits du compte de backup alignés sur grants-sync, toutes
les variables de databricks.yml à adapter (backup_root par cible, backup_principal…),
arborescence complète du stockage, point de reprise (50 tables / 2 min), portée réelle de
dry_run, date des tables par restore_point, chemin du bundle dans le contournement A.1,
téléchargement de Terraform bloqué (signature expirée). Notes : §2.8 à §2.19, notebooks
dépendant de lib/, max_parallel 4. Runbook : scénario B réordonné (bundle déployé avant les
restaurations, jobs non dupliqués, pipelines et fichiers de volumes ajoutés), option CLI de
restauration des notebooks retirée (format v4.1), structure du backup réelle, CLI actuelle,
restore_point / target_catalog / include_stale, doublon B.3.bis et références à la démo,
à GitHub Actions et au dossier terraform/ supprimés.

Co-Authored-By: Claude Opus 5.5 <noreply@anthropic.com>
</commit_message>
<xml_diff>
--- a/docs/DR_Backup_Guide_Deploiement_v4.2.docx
+++ b/docs/DR_Backup_Guide_Deploiement_v4.2.docx
@@ -806,19 +806,27 @@
         <w:br/>
         <w:t xml:space="preserve">    {catalog}/{schema}/{table}/      (seul le delta est ecrit)</w:t>
         <w:br/>
-        <w:t xml:space="preserve">    _manifests/{AAAA-MM-JJ}.json     resultat de chaque run</w:t>
+        <w:t xml:space="preserve">    _manifests/{AAAA-MM-JJ}.json     resultat de chaque table, chaque run</w:t>
         <w:br/>
         <w:t xml:space="preserve">    _checkpoints/{AAAA-MM-JJ}.json   reprise apres interruption</w:t>
         <w:br/>
         <w:t xml:space="preserve">    _last_versions.json              versions Delta deja sauvegardees</w:t>
         <w:br/>
+        <w:t xml:space="preserve">    _reclone_archive/{AAAA-MM-JJ}/   anciennes copies remplacees (a purger a la main)</w:t>
+        <w:br/>
+        <w:t xml:space="preserve">  volumes/</w:t>
+        <w:br/>
+        <w:t xml:space="preserve">    files/{catalog}/{schema}/{volume}/{AAAA-MM-JJ}/   fichiers des volumes manages</w:t>
+        <w:br/>
+        <w:t xml:space="preserve">    _index/                          etat de chaque volume, jour par jour (Delta)</w:t>
+        <w:br/>
         <w:t xml:space="preserve">  snapshots/</w:t>
         <w:br/>
         <w:t xml:space="preserve">    monthly/{AAAA-MM}/               archive mensuelle independante</w:t>
         <w:br/>
-        <w:t xml:space="preserve">  {AAAA-MM-JJ}/                     metadonnees UC, jobs, notebooks, rapport</w:t>
+        <w:t xml:space="preserve">  {AAAA-MM-JJ}/                     DDL Unity Catalog, jobs, pipelines, workspace, rapport</w:t>
         <w:br/>
-        <w:t xml:space="preserve">  latest.json                       pointeur vers le dernier backup reussi</w:t>
+        <w:t xml:space="preserve">  latest.json                       pointeur vers le dernier backup</w:t>
       </w:r>
     </w:p>
     <w:p>
@@ -1435,7 +1443,7 @@
           </w:tcPr>
           <w:p>
             <w:r>
-              <w:t>USE CATALOG, USE SCHEMA, SELECT</w:t>
+              <w:t>USE CATALOG, USE SCHEMA, BROWSE, SELECT, READ VOLUME, EXECUTE</w:t>
             </w:r>
           </w:p>
         </w:tc>
@@ -1445,7 +1453,7 @@
           </w:tcPr>
           <w:p>
             <w:r>
-              <w:t>Lire les tables sources</w:t>
+              <w:t>Lire tables, volumes (fichiers) et fonctions ; droits vérifiés par dr-backup-grants-sync (§8)</w:t>
             </w:r>
           </w:p>
         </w:tc>
@@ -1501,7 +1509,7 @@
         <w:t xml:space="preserve">  ON EXTERNAL LOCATION `drbackup-location` TO `&lt;application-id-du-sp&gt;`;</w:t>
         <w:br/>
         <w:br/>
-        <w:t>GRANT USE CATALOG, USE SCHEMA, SELECT</w:t>
+        <w:t>GRANT USE CATALOG, USE SCHEMA, BROWSE, SELECT, READ VOLUME, EXECUTE</w:t>
         <w:br/>
         <w:t xml:space="preserve">  ON CATALOG `&lt;catalog-a-sauvegarder&gt;` TO `&lt;application-id-du-sp&gt;`;</w:t>
         <w:br/>
@@ -3706,7 +3714,7 @@
           <w:color w:val="C00000"/>
           <w:sz w:val="20"/>
         </w:rPr>
-        <w:t>Attention : le dossier lib/ est indispensable : les notebooks d'export (01, 03, 04, 14) et de restauration (08, 09, 12, 13, 15) en dépendent. Le bundle le déploie à côté des notebooks et les jobs le trouvent automatiquement : aucun chemin à renseigner. Une extraction partielle de l'archive fait échouer le diff, le rapport et la copie des fichiers des volumes, et le backup des définitions de volumes et fonctions est sauté (avertissement dans la sortie de 01_uc_metadata).</w:t>
+        <w:t>Attention : le dossier lib/ est indispensable : les notebooks d'export (01, 03, 04, 05, 14) et de restauration (08, 09, 12, 13, 15) en dépendent. Le bundle le déploie à côté des notebooks et les jobs le trouvent automatiquement : aucun chemin à renseigner. Une extraction partielle de l'archive fait échouer le diff, le rapport, l'export du workspace et la copie des fichiers des volumes, et le backup des définitions de volumes et fonctions est sauté (avertissement dans la sortie de 01_uc_metadata).</w:t>
       </w:r>
     </w:p>
     <w:p>
@@ -3723,7 +3731,7 @@
     </w:p>
     <w:p>
       <w:r>
-        <w:t>Trois valeurs sont à adapter à l'environnement cible. Tout le reste peut rester en configuration par défaut.</w:t>
+        <w:t>Les valeurs suivantes sont à adapter à l'environnement cible. Le reste peut rester en configuration par défaut.</w:t>
       </w:r>
     </w:p>
     <w:tbl>
@@ -3776,7 +3784,7 @@
           </w:tcPr>
           <w:p>
             <w:r>
-              <w:t>backup_root</w:t>
+              <w:t>backup_root (dans chaque cible)</w:t>
             </w:r>
           </w:p>
         </w:tc>
@@ -3786,7 +3794,7 @@
           </w:tcPr>
           <w:p>
             <w:r>
-              <w:t>abfss://&lt;container&gt;@&lt;compte&gt;.dfs.core.windows.net/backup</w:t>
+              <w:t>abfss://&lt;container&gt;@&lt;compte&gt;.dfs.core.windows.net/backup — les cibles redéfinissent cette variable : la renseigner sous targets.&lt;cible&gt;.variables</w:t>
             </w:r>
           </w:p>
         </w:tc>
@@ -3831,6 +3839,72 @@
           <w:p>
             <w:r>
               <w:t>URL du workspace Databricks</w:t>
+            </w:r>
+          </w:p>
+        </w:tc>
+      </w:tr>
+      <w:tr>
+        <w:tc>
+          <w:tcPr>
+            <w:tcW w:type="dxa" w:w="2835"/>
+          </w:tcPr>
+          <w:p>
+            <w:r>
+              <w:t>backup_principal</w:t>
+            </w:r>
+          </w:p>
+        </w:tc>
+        <w:tc>
+          <w:tcPr>
+            <w:tcW w:type="dxa" w:w="6236"/>
+          </w:tcPr>
+          <w:p>
+            <w:r>
+              <w:t>Groupe ou service principal du backup (job dr-backup-grants-sync, §8) : obligatoire, le job échoue s'il est vide</w:t>
+            </w:r>
+          </w:p>
+        </w:tc>
+      </w:tr>
+      <w:tr>
+        <w:tc>
+          <w:tcPr>
+            <w:tcW w:type="dxa" w:w="2835"/>
+          </w:tcPr>
+          <w:p>
+            <w:r>
+              <w:t>backup_location</w:t>
+            </w:r>
+          </w:p>
+        </w:tc>
+        <w:tc>
+          <w:tcPr>
+            <w:tcW w:type="dxa" w:w="6236"/>
+          </w:tcPr>
+          <w:p>
+            <w:r>
+              <w:t>Nom de l'External Location du backup (§2.4)</w:t>
+            </w:r>
+          </w:p>
+        </w:tc>
+      </w:tr>
+      <w:tr>
+        <w:tc>
+          <w:tcPr>
+            <w:tcW w:type="dxa" w:w="2835"/>
+          </w:tcPr>
+          <w:p>
+            <w:r>
+              <w:t>grants_sync_mode</w:t>
+            </w:r>
+          </w:p>
+        </w:tc>
+        <w:tc>
+          <w:tcPr>
+            <w:tcW w:type="dxa" w:w="6236"/>
+          </w:tcPr>
+          <w:p>
+            <w:r>
+              <w:t>report (défaut) puis apply une fois le premier constat validé (§8)</w:t>
             </w:r>
           </w:p>
         </w:tc>
@@ -3860,6 +3934,15 @@
         <w:t xml:space="preserve">    default: "exploitation@client.ch"</w:t>
         <w:br/>
         <w:br/>
+        <w:t xml:space="preserve">  backup_principal:</w:t>
+        <w:br/>
+        <w:t xml:space="preserve">    default: "dr-backup-readers"</w:t>
+        <w:br/>
+        <w:t xml:space="preserve">  backup_location:</w:t>
+        <w:br/>
+        <w:t xml:space="preserve">    default: "drbackup-location"</w:t>
+        <w:br/>
+        <w:br/>
         <w:t>targets:</w:t>
         <w:br/>
         <w:t xml:space="preserve">  prod:</w:t>
@@ -3869,6 +3952,10 @@
         <w:t xml:space="preserve">    workspace:</w:t>
         <w:br/>
         <w:t xml:space="preserve">      host: https://adb-1234567890123456.7.azuredatabricks.net</w:t>
+        <w:br/>
+        <w:t xml:space="preserve">    variables:</w:t>
+        <w:br/>
+        <w:t xml:space="preserve">      backup_root: "abfss://uc-backup@stclientdrbackup.dfs.core.windows.net/backup"</w:t>
       </w:r>
     </w:p>
     <w:p>
@@ -4300,7 +4387,7 @@
     </w:p>
     <w:p>
       <w:r>
-        <w:t>Le déploiement crée deux jobs, tous deux en pause :</w:t>
+        <w:t>Le déploiement crée trois jobs, tous en pause :</w:t>
       </w:r>
     </w:p>
     <w:tbl>
@@ -4426,6 +4513,38 @@
           </w:p>
         </w:tc>
       </w:tr>
+      <w:tr>
+        <w:tc>
+          <w:tcPr>
+            <w:tcW w:type="dxa" w:w="2551"/>
+          </w:tcPr>
+          <w:p>
+            <w:r>
+              <w:t>dr-backup-grants-sync</w:t>
+            </w:r>
+          </w:p>
+        </w:tc>
+        <w:tc>
+          <w:tcPr>
+            <w:tcW w:type="dxa" w:w="4535"/>
+          </w:tcPr>
+          <w:p>
+            <w:r>
+              <w:t>Vérifie / accorde les droits du compte de backup (§8)</w:t>
+            </w:r>
+          </w:p>
+        </w:tc>
+        <w:tc>
+          <w:tcPr>
+            <w:tcW w:type="dxa" w:w="1984"/>
+          </w:tcPr>
+          <w:p>
+            <w:r>
+              <w:t>00:30 UTC, en pause</w:t>
+            </w:r>
+          </w:p>
+        </w:tc>
+      </w:tr>
     </w:tbl>
     <w:p/>
     <w:p>
@@ -4468,7 +4587,7 @@
     </w:p>
     <w:p>
       <w:r>
-        <w:t>Les clusters des jobs sont créés à chaque exécution puis détruits : leurs logs disparaissent avec eux, et la sortie affichée dans l'interface est tronquée au-delà d'un certain volume. Pour permettre un diagnostic après coup, les deux jobs archivent automatiquement leurs logs.</w:t>
+        <w:t>Les clusters des jobs sont créés à chaque exécution puis détruits : leurs logs disparaissent avec eux, et la sortie affichée dans l'interface est tronquée au-delà d'un certain volume. Pour permettre un diagnostic après coup, dr-backup-daily et dr-backup-monthly archivent automatiquement leurs logs.</w:t>
       </w:r>
     </w:p>
     <w:p>
@@ -5158,7 +5277,7 @@
           </w:tcPr>
           <w:p>
             <w:r>
-              <w:t>Checkpoint écrit toutes les 5 tables dans incremental/_checkpoints/{date}.json</w:t>
+              <w:t>Checkpoint écrit toutes les 50 tables ou toutes les 2 minutes dans incremental/_checkpoints/{date}.json</w:t>
             </w:r>
           </w:p>
         </w:tc>
@@ -5168,7 +5287,7 @@
           </w:tcPr>
           <w:p>
             <w:r>
-              <w:t>Reprise à la table près</w:t>
+              <w:t>Au plus 50 tables recopiées</w:t>
             </w:r>
           </w:p>
         </w:tc>
@@ -5580,7 +5699,7 @@
           </w:tcPr>
           <w:p>
             <w:r>
-              <w:t>Simulation, aucune écriture ni suppression</w:t>
+              <w:t>Simule la rétention, la purge et la copie des fichiers de volumes ; la copie des tables et l'export s'exécutent normalement</w:t>
             </w:r>
           </w:p>
         </w:tc>
@@ -7372,7 +7491,7 @@
     </w:p>
     <w:p>
       <w:r>
-        <w:t>07_restore ne restaure que les tables sauvegardées avec succès à la date de référence : le dernier backup, ou le dernier au plus tard à la date du point de restauration. Les tables présentes dans le stockage mais absentes de ce backup sont listées comme périmées ; include_stale = true les restaure quand même, dans l'état de leur dernier backup réussi.</w:t>
+        <w:t>07_restore ne restaure que les tables sauvegardées avec succès à la date de référence : le dernier backup, ou le dernier au plus tard à la date du point de restauration. Les tables présentes dans le stockage mais absentes de ce backup sont listées comme périmées ; include_stale = true (07_restore ou 10_restore_orchestrator) les restaure quand même, dans l'état de leur dernier backup réussi. La date d'une restauration de tables se fixe par restore_point (AAAA-MM-JJ ou horodatage), et non par backup_date.</w:t>
       </w:r>
     </w:p>
     <w:p>
@@ -8600,7 +8719,7 @@
           </w:tcPr>
           <w:p>
             <w:r>
-              <w:t>Bundle déployé, deux jobs visibles dans Workflows</w:t>
+              <w:t>Bundle déployé, trois jobs visibles dans Workflows (daily, monthly, grants-sync)</w:t>
             </w:r>
           </w:p>
         </w:tc>
@@ -8928,7 +9047,9 @@
           <w:color w:val="1F497D"/>
           <w:sz w:val="18"/>
         </w:rPr>
-        <w:t>databricks workspace import /Workspace/Shared/dr-backup/notebooks/02_data_clone \</w:t>
+        <w:t>databricks workspace import \</w:t>
+        <w:br/>
+        <w:t xml:space="preserve">  /Workspace/Shared/dr-backup/.bundle/dr-backup/prod/files/notebooks/02_data_clone \</w:t>
         <w:br/>
         <w:t xml:space="preserve">  --file notebooks/02_data_clone.py --language PYTHON \</w:t>
         <w:br/>
@@ -8959,6 +9080,50 @@
           <w:sz w:val="20"/>
         </w:rPr>
         <w:t>Attention : ce contournement pousse le code mais ne crée pas les jobs. Il permet de corriger un notebook sur un déploiement existant ; il ne remplace pas un bundle deploy initial.</w:t>
+      </w:r>
+    </w:p>
+    <w:p>
+      <w:r>
+        <w:t>Variante : le téléchargement de Terraform lui-même est refusé.</w:t>
+      </w:r>
+    </w:p>
+    <w:p>
+      <w:pPr>
+        <w:spacing w:before="40" w:after="40"/>
+        <w:ind w:left="283"/>
+        <w:shd w:val="clear" w:color="auto" w:fill="F0F0F0"/>
+      </w:pPr>
+      <w:r>
+        <w:rPr>
+          <w:rFonts w:ascii="Courier New" w:hAnsi="Courier New"/>
+          <w:color w:val="1F497D"/>
+          <w:sz w:val="18"/>
+        </w:rPr>
+        <w:t>Error: error downloading Terraform: unable to verify checksums signature: openpgp: key expired</w:t>
+      </w:r>
+    </w:p>
+    <w:p>
+      <w:r>
+        <w:t>La CLI vérifie la signature du binaire Terraform qu'elle télécharge ; une clé de signature expirée bloque le téléchargement. Installer Terraform sur le poste (ou réutiliser celui d'un déploiement précédent, sous .databricks/bundle/&lt;cible&gt;/bin/) et l'indiquer à la CLI :</w:t>
+      </w:r>
+    </w:p>
+    <w:p>
+      <w:pPr>
+        <w:spacing w:before="40" w:after="40"/>
+        <w:ind w:left="283"/>
+        <w:shd w:val="clear" w:color="auto" w:fill="F0F0F0"/>
+      </w:pPr>
+      <w:r>
+        <w:rPr>
+          <w:rFonts w:ascii="Courier New" w:hAnsi="Courier New"/>
+          <w:color w:val="1F497D"/>
+          <w:sz w:val="18"/>
+        </w:rPr>
+        <w:t>export DATABRICKS_TF_EXEC_PATH=/chemin/vers/terraform</w:t>
+        <w:br/>
+        <w:t>export DATABRICKS_TF_VERSION=&lt;version affichée par terraform version&gt;</w:t>
+        <w:br/>
+        <w:t>databricks bundle validate --target &lt;cible&gt;</w:t>
       </w:r>
     </w:p>
     <w:p>
@@ -9226,7 +9391,7 @@
         <w:pStyle w:val="ListBullet"/>
       </w:pPr>
       <w:r>
-        <w:t>Catalog exclu par conception : hive_metastore, system, samples, information_schema</w:t>
+        <w:t>Catalog exclu par conception (hive_metastore, system, samples) ou schéma information_schema</w:t>
       </w:r>
     </w:p>
     <w:p>

</xml_diff>